<commit_message>
Expand book report to ~6 pages and fix section summary count
Co-Authored-By: Claude Opus 5.5 <noreply@anthropic.com>
Claude-Session: https://claude.ai/code/session_01QWWxGnXdaFP6TZy6bNqdjA
</commit_message>
<xml_diff>
--- a/경제전쟁의흑역사_독후감.docx
+++ b/경제전쟁의흑역사_독후감.docx
@@ -418,7 +418,22 @@
           <w:sz w:val="22"/>
           <w:szCs w:val="22"/>
         </w:rPr>
-        <w:t xml:space="preserve">다섯 가지 사례를 되짚어 보면 하나의 공통점이 보인다. 경제 전쟁에서 완전한 승자는 거의 없다는 것이다. 관세로 문을 걸어 잠근 나라는 수출 시장을 잃었고, 환율 전쟁의 충격을 잘못 다룬 나라는 긴 침체에 빠졌으며, 무력으로 시장을 연 나라도 결국 역사의 심판을 피하지 못했다. 저자가 자유무역과 보호무역 사이의 오랜 갈등을 추적하면서 보여 주는 것은 어느 한쪽이 절대적으로 옳다는 결론이 아니라, 상대를 무너뜨리려는 극단적인 선택이 결국 자신에게 돌아온다는 교훈이라고 생각한다.</w:t>
+        <w:t xml:space="preserve">여섯 가지 이야기를 되짚어 보면 하나의 공통점이 보인다. 경제 전쟁에서 완전한 승자는 거의 없다는 것이다. 관세로 문을 걸어 잠근 나라는 수출 시장을 잃었고, 환율 전쟁의 충격을 잘못 다룬 나라는 긴 침체에 빠졌으며, 무력으로 시장을 연 나라도 결국 역사의 심판을 피하지 못했다. 저자가 자유무역과 보호무역 사이의 오랜 갈등을 추적하면서 보여 주는 것은 어느 한쪽이 절대적으로 옳다는 결론이 아니라, 상대를 무너뜨리려는 극단적인 선택이 결국 자신에게 돌아온다는 교훈이라고 생각한다.</w:t>
+      </w:r>
+    </w:p>
+    <w:p>
+      <w:pPr>
+        <w:spacing w:after="80" w:line="276" w:lineRule="auto"/>
+        <w:ind w:firstLine="220"/>
+        <w:jc w:val="both"/>
+      </w:pPr>
+      <w:r>
+        <w:rPr>
+          <w:rFonts w:ascii="맑은 고딕" w:cs="맑은 고딕" w:eastAsia="맑은 고딕" w:hAnsi="맑은 고딕"/>
+          <w:sz w:val="22"/>
+          <w:szCs w:val="22"/>
+        </w:rPr>
+        <w:t xml:space="preserve">물론 이 교훈을 "무조건 문을 활짝 열어야 한다"는 뜻으로만 받아들일 수는 없다. 자유무역은 전체 파이를 키우지만, 그 과정에서 경쟁에 밀린 산업과 노동자에게는 분명한 고통을 남긴다. 그 고통을 외면하면 사회의 불만이 쌓이고, 결국 정치가 극단적인 보호무역으로 방향을 트는 계기가 된다. 결국 중요한 것은 자유무역과 보호무역 가운데 하나를 고르는 것이 아니라, 개방으로 얻은 이익을 어떻게 나누고 피해를 입은 사람들을 어떻게 돕느냐 하는 문제라고 생각한다. 이 책은 그 균형이 무너졌을 때 어떤 일이 벌어지는지를 역사적 사례로 보여 준다는 점에서, 단순한 경제사 책을 넘어 사회를 어떻게 운영해야 하는지에 대한 질문을 던지는 책이었다.</w:t>
       </w:r>
     </w:p>
     <w:p>
@@ -768,6 +783,21 @@
     </w:p>
     <w:p>
       <w:pPr>
+        <w:spacing w:after="80" w:line="276" w:lineRule="auto"/>
+        <w:ind w:firstLine="220"/>
+        <w:jc w:val="both"/>
+      </w:pPr>
+      <w:r>
+        <w:rPr>
+          <w:rFonts w:ascii="맑은 고딕" w:cs="맑은 고딕" w:eastAsia="맑은 고딕" w:hAnsi="맑은 고딕"/>
+          <w:sz w:val="22"/>
+          <w:szCs w:val="22"/>
+        </w:rPr>
+        <w:t xml:space="preserve">또한 정보를 받아들이는 태도도 달라졌다. 경제 전쟁이 벌어질 때마다 각 나라는 자신의 행동을 "정당한 방어"로, 상대의 행동을 "부당한 공격"으로 설명한다. 책 속 사례에서도 같은 사건이 나라마다 전혀 다르게 해석되었다. 그래서 이제는 한 가지 기사나 한 사람의 주장만 보고 판단하기보다, 상대편의 입장은 어떻게 보도되는지, 숫자와 사실은 무엇인지 따로 확인해 보려고 한다. 특히 인터넷에서 쉽게 퍼지는 자극적인 제목이나 감정적인 주장일수록 한 번 더 의심하고 근거를 찾아보는 습관을 들이게 되었다.</w:t>
+      </w:r>
+    </w:p>
+    <w:p>
+      <w:pPr>
         <w:spacing w:after="60" w:before="140" w:line="276" w:lineRule="auto"/>
       </w:pPr>
       <w:r>
@@ -929,6 +959,21 @@
           <w:szCs w:val="22"/>
         </w:rPr>
         <w:t xml:space="preserve">『경제 전쟁의 흑역사』는 제목 그대로 인류가 경제를 둘러싸고 저지른 실수와 무모함의 기록이다. 하지만 이 책을 다 읽고 나서 남은 감정은 절망보다는 경계와 희망에 가까웠다. 과거의 실수를 알고 있다면 같은 실수를 반복하지 않을 수 있기 때문이다. 저자가 24가지 경제 전쟁을 통해 말하고자 한 것은, 상대를 무너뜨리려는 싸움보다 함께 규칙을 만들고 지키려는 노력이 결국 모두를 더 풍요롭게 한다는 사실이라고 생각한다.</w:t>
+      </w:r>
+    </w:p>
+    <w:p>
+      <w:pPr>
+        <w:spacing w:after="80" w:line="276" w:lineRule="auto"/>
+        <w:ind w:firstLine="220"/>
+        <w:jc w:val="both"/>
+      </w:pPr>
+      <w:r>
+        <w:rPr>
+          <w:rFonts w:ascii="맑은 고딕" w:cs="맑은 고딕" w:eastAsia="맑은 고딕" w:hAnsi="맑은 고딕"/>
+          <w:sz w:val="22"/>
+          <w:szCs w:val="22"/>
+        </w:rPr>
+        <w:t xml:space="preserve">책을 덮으며 가장 오래 남은 질문은 "그렇다면 경제 전쟁을 막을 방법은 없는가"였다. 책 속의 역사는 그 답이 쉽지 않다는 것을 보여 주지만, 동시에 희망의 단서도 준다. 대공황과 세계대전을 겪은 뒤 각국이 관세를 낮추고 국제 무역 규칙을 만들기 위해 협력했던 것처럼, 경제 전쟁의 상처는 새로운 협력의 계기가 되기도 했다. 디지털 세금 문제를 두고 여러 나라가 끝내 국제 합의를 이끌어 낸 것도 같은 예라고 생각한다. 결국 경제 전쟁을 줄이는 힘은 상대를 이기려는 의지보다, 공동의 규칙을 만들고 지키려는 인내에서 나온다는 것을 배웠다.</w:t>
       </w:r>
     </w:p>
     <w:p>

</xml_diff>

<commit_message>
Fact-check book report and soften unverified claims about book structure
Co-Authored-By: Claude Opus 5.5 <noreply@anthropic.com>
Claude-Session: https://claude.ai/code/session_01QWWxGnXdaFP6TZy6bNqdjA
</commit_message>
<xml_diff>
--- a/경제전쟁의흑역사_독후감.docx
+++ b/경제전쟁의흑역사_독후감.docx
@@ -73,22 +73,22 @@
           <w:sz w:val="22"/>
           <w:szCs w:val="22"/>
         </w:rPr>
-        <w:t xml:space="preserve">전쟁이라고 하면 보통 총과 대포, 무너진 건물 같은 장면이 먼저 떠오른다. 그런데 이 책은 첫 장을 넘기자마자 그런 고정관념을 흔든다. 저자 이완배는 15세기 대항해시대부터 오늘날까지 세계사를 뒤흔든 굵직한 경제 전쟁 24가지를 차례로 보여 주면서, 인류의 역사에서 가장 치열하고 오래된 싸움은 사실 "누가 더 많이, 더 싸게, 더 유리하게 사고파느냐"를 둘러싼 싸움이었다고 말한다. 제국주의가 휩쓸던 19세기까지는 그 싸움에 실제로 총칼이 동원되었지만, 시간이 지날수록 경제 전쟁은 시장 쟁탈전, 화폐 전쟁, 무역 전쟁의 모습으로 바뀌었다. 겉으로는 총성이 들리지 않지만, 그 결과는 군사 전쟁 못지않게 한 나라의 흥망을 좌우하고 패권국의 지위를 흔든다.</w:t>
-      </w:r>
-    </w:p>
-    <w:p>
-      <w:pPr>
-        <w:spacing w:after="80" w:line="276" w:lineRule="auto"/>
-        <w:ind w:firstLine="220"/>
-        <w:jc w:val="both"/>
-      </w:pPr>
-      <w:r>
-        <w:rPr>
-          <w:rFonts w:ascii="맑은 고딕" w:cs="맑은 고딕" w:eastAsia="맑은 고딕" w:hAnsi="맑은 고딕"/>
-          <w:sz w:val="22"/>
-          <w:szCs w:val="22"/>
-        </w:rPr>
-        <w:t xml:space="preserve">책의 부제처럼 이 책이 다루는 것은 "시장 질서를 박살 내고 세계경제에 자살골을 날린 무모한 대결"들이다. 저자는 이긴 쪽의 영광보다 싸움이 남긴 상처, 그리고 당장의 이익을 위해 내린 결정이 결국 자신에게 되돌아오는 역설에 초점을 맞춘다. 경제 기자로 오래 일한 저자답게 어려운 경제 개념도 사건과 인물 중심으로 풀어내어, 경제학을 깊이 공부하지 않은 나도 끝까지 흥미롭게 읽을 수 있었다. 처음 이 책을 펼쳤을 때 나는 경제사를 다룬 책이라 딱딱하고 어려울 것이라 걱정했다. 그러나 각 장이 하나의 사건을 중심으로 짧고 선명하게 구성되어 있어, 마치 역사 드라마의 여러 에피소드를 이어 보는 느낌으로 읽을 수 있었다. 무엇보다 책장을 넘길수록 "이 이야기가 지금 우리의 뉴스와 똑같다"는 생각이 반복해서 들었다. 수백 년 전의 무역 갈등과 최근의 관세 분쟁이 놀랍도록 닮아 있다는 점이 이 책을 끝까지 붙잡고 읽게 만든 가장 큰 힘이었다. 아래에서는 인상 깊었던 부분들과 그 이유, 이를 오늘날의 기업에 적용할 방법, 그리고 책을 읽은 뒤 달라진 나의 생각과 행동을 차례로 정리해 보려 한다.</w:t>
+        <w:t xml:space="preserve">전쟁이라고 하면 보통 총과 대포, 무너진 건물 같은 장면이 먼저 떠오른다. 그런데 이 책은 그런 고정관념을 흔든다. 저자 이완배는 15세기 대항해시대부터 오늘날까지 세계사를 뒤흔든 굵직한 경제 전쟁 24가지를 차례로 보여 주면서, 인류의 역사에서 가장 치열하고 오래된 싸움은 사실 "누가 더 많이, 더 싸게, 더 유리하게 사고파느냐"를 둘러싼 싸움이었다고 말한다. 제국주의가 휩쓸던 19세기까지는 그 싸움에 실제로 총칼이 동원되었지만, 시간이 지날수록 경제 전쟁은 시장 쟁탈전, 화폐 전쟁, 무역 전쟁의 모습으로 바뀌었다. 겉으로는 총성이 들리지 않지만, 그 결과는 군사 전쟁 못지않게 한 나라의 흥망을 좌우하고 패권국의 지위를 흔든다.</w:t>
+      </w:r>
+    </w:p>
+    <w:p>
+      <w:pPr>
+        <w:spacing w:after="80" w:line="276" w:lineRule="auto"/>
+        <w:ind w:firstLine="220"/>
+        <w:jc w:val="both"/>
+      </w:pPr>
+      <w:r>
+        <w:rPr>
+          <w:rFonts w:ascii="맑은 고딕" w:cs="맑은 고딕" w:eastAsia="맑은 고딕" w:hAnsi="맑은 고딕"/>
+          <w:sz w:val="22"/>
+          <w:szCs w:val="22"/>
+        </w:rPr>
+        <w:t xml:space="preserve">책의 부제처럼 이 책이 다루는 것은 "시장 질서를 박살 내고 세계경제에 자살골을 날린 무모한 대결"들이다. 저자는 이긴 쪽의 영광보다 싸움이 남긴 상처, 그리고 당장의 이익을 위해 내린 결정이 결국 자신에게 되돌아오는 역설에 초점을 맞춘다. 경제 기자로 오래 일한 저자답게 어려운 경제 개념도 사건과 인물 중심으로 풀어내어, 경제학을 깊이 공부하지 않은 나도 끝까지 흥미롭게 읽을 수 있었다. 처음 이 책을 펼쳤을 때 나는 경제사를 다룬 책이라 딱딱하고 어려울 것이라 걱정했다. 그러나 스물네 개의 경제 전쟁을 사건 하나하나 따라가는 방식이라, 마치 역사 드라마의 여러 에피소드를 이어 보는 느낌으로 읽을 수 있었다. 무엇보다 책장을 넘길수록 "이 이야기가 지금 우리의 뉴스와 똑같다"는 생각이 반복해서 들었다. 수백 년 전의 무역 갈등과 최근의 관세 분쟁이 놀랍도록 닮아 있다는 점이 이 책을 끝까지 붙잡고 읽게 만든 가장 큰 힘이었다. 아래에서는 인상 깊었던 부분들과 그 이유, 이를 오늘날의 기업에 적용할 방법, 그리고 책을 읽은 뒤 달라진 나의 생각과 행동을 차례로 정리해 보려 한다.</w:t>
       </w:r>
     </w:p>
     <w:p>
@@ -133,7 +133,7 @@
           <w:sz w:val="22"/>
           <w:szCs w:val="22"/>
         </w:rPr>
-        <w:t xml:space="preserve">[내용] 책의 앞부분은 대항해시대 이후 유럽 강대국들이 무역로와 식민지를 차지하기 위해 벌인 싸움을 다룬다. 그 정점은 19세기 제국주의 시대다. 대표적인 사례가 영국과 청나라 사이의 아편전쟁이다. 영국은 청에서 차를 대량으로 수입하면서 막대한 은이 빠져나가자, 그 적자를 메우려고 인도산 아편을 청에 밀수출했다. 청이 아편을 몰수해 폐기하자 영국은 군함을 보내 전쟁을 일으켰고, 그 결과 맺어진 난징조약으로 청은 홍콩을 내주고 항구를 강제로 열어야 했다.</w:t>
+        <w:t xml:space="preserve">[내용] 책은 대항해시대 이후 유럽 강대국들이 무역로와 식민지를 차지하기 위해 벌인 싸움에서 출발한다. 총칼을 앞세운 경제 전쟁의 정점은 19세기 제국주의 시대였다. 대표적인 사례가 영국과 청나라 사이의 아편전쟁이다. 영국은 청에서 차를 대량으로 수입하면서 막대한 은이 빠져나가자, 그 적자를 메우려고 인도산 아편을 청에 밀수출했다. 청이 아편을 몰수해 폐기하자 영국은 군함을 보내 전쟁을 일으켰고, 그 결과 맺어진 난징조약으로 청은 홍콩을 내주고 항구를 강제로 열어야 했다.</w:t>
       </w:r>
     </w:p>
     <w:p>
@@ -178,7 +178,7 @@
           <w:sz w:val="22"/>
           <w:szCs w:val="22"/>
         </w:rPr>
-        <w:t xml:space="preserve">[내용] 1929년 대공황이 시작되자 미국은 자국 산업을 보호하겠다며 1930년 스무트-홀리 관세법을 제정했다. 2만 개가 넘는 수입품에 높은 관세를 매긴 이 법은 미국 역사상 가장 높은 수준의 관세로 꼽힌다. 당시 천 명이 넘는 경제학자들이 대통령에게 거부권 행사를 요청했지만 법은 그대로 시행되었다. 그러자 캐나다와 유럽 여러 나라가 곧바로 보복 관세로 맞섰고, 세계 무역량은 몇 년 사이에 크게 줄어들었다. 미국 제품을 사 주던 해외 시장이 닫히면서 미국 경제 역시 더 깊은 불황으로 빠져들었다.</w:t>
+        <w:t xml:space="preserve">[내용] 1929년 대공황이 시작되자 미국은 자국 산업을 보호하겠다며 1930년 스무트-홀리 관세법을 제정했다. 2만 개가 넘는 수입품에 높은 관세를 매긴 이 법은 미국 역사상 손꼽히게 높은 관세로 알려져 있다. 당시 천 명이 넘는 경제학자들이 대통령에게 거부권 행사를 요청했지만 법은 그대로 시행되었다. 그러자 캐나다와 유럽 여러 나라가 곧바로 보복 관세로 맞섰고, 세계 무역량은 몇 년 사이에 크게 줄어들었다. 미국 제품을 사 주던 해외 시장까지 닫히면서, 이 법은 대공황을 더 깊고 길게 만든 요인 가운데 하나로 꼽힌다.</w:t>
       </w:r>
     </w:p>
     <w:p>
@@ -223,7 +223,7 @@
           <w:sz w:val="22"/>
           <w:szCs w:val="22"/>
         </w:rPr>
-        <w:t xml:space="preserve">[내용] 1980년대 미국은 막대한 무역 적자에 시달렸고, 그 상대편에는 무섭게 성장하던 일본이 있었다. 1985년 9월, 미국·일본·서독·영국·프랑스의 재무장관들이 뉴욕 플라자 호텔에 모여 달러 가치를 낮추기로 합의했다. 이른바 플라자 합의다. 이후 엔화 가치는 급격히 올라 불과 2년여 만에 달러 대비 두 배 가까이 뛰었다. 수출 경쟁력이 떨어질 것을 걱정한 일본 정부는 금리를 크게 낮추었고, 풀린 돈은 부동산과 주식으로 몰려 거대한 거품을 만들었다. 1990년대 초 거품이 꺼지자 일본은 "잃어버린 10년", 나아가 "잃어버린 20년"이라 불리는 긴 침체에 빠졌다.</w:t>
+        <w:t xml:space="preserve">[내용] 1980년대 미국은 막대한 무역 적자에 시달렸고, 그 상대편에는 무섭게 성장하던 일본이 있었다. 1985년 9월, 미국·일본·서독·영국·프랑스의 재무장관과 중앙은행 총재들이 뉴욕 플라자 호텔에 모여 달러 가치를 낮추기로 합의했다. 이른바 플라자 합의다. 이후 엔화 가치는 급격히 올라 불과 2년여 만에 달러 대비 두 배 가까이 뛰었다. 엔고로 인한 불황을 걱정한 일본은 기준금리를 크게 낮추었고, 풀린 돈은 부동산과 주식으로 몰려 거대한 거품을 만들었다. 1990년대 초 거품이 꺼지자 일본은 "잃어버린 10년", 나아가 "잃어버린 20년"이라 불리는 긴 침체에 빠졌다.</w:t>
       </w:r>
     </w:p>
     <w:p>
@@ -268,7 +268,7 @@
           <w:sz w:val="22"/>
           <w:szCs w:val="22"/>
         </w:rPr>
-        <w:t xml:space="preserve">[내용] 책의 후반부는 우리가 뉴스로 직접 지켜본 사건들로 이어진다. 2018년 본격화한 미중 무역 분쟁은 서로의 수입품에 관세를 주고받는 데서 시작해, 화웨이 제재와 첨단 반도체 수출 통제로 번지며 기술 패권 경쟁으로 확대되었다. 한국과 일본 사이에서도 2019년 일본이 반도체 핵심 소재 3개 품목(불화수소, 포토레지스트, 플루오린 폴리이미드)의 수출을 규제하고 한국을 이른바 화이트리스트에서 제외하면서 무역 분쟁이 벌어졌다. 한국에서는 일본 제품 불매 운동이 일어났고, 정부와 기업은 소재·부품·장비의 국산화와 수입처 다변화에 나섰다.</w:t>
+        <w:t xml:space="preserve">[내용] 책은 우리가 뉴스로 직접 지켜본 최근의 사건들까지 다룬다. 2018년 본격화한 미중 무역 분쟁은 서로의 수입품에 관세를 주고받는 데서 시작해, 화웨이 제재와 첨단 반도체 수출 통제로 번지며 기술 패권 경쟁으로 확대되었다. 한국과 일본 사이에서도 2019년 일본이 반도체 핵심 소재 3개 품목(불화수소, 포토레지스트, 플루오린 폴리이미드)의 수출을 규제하고 한국을 이른바 화이트리스트에서 제외하면서 무역 분쟁이 벌어졌다. 한국에서는 일본 제품 불매 운동이 일어났고, 정부와 기업은 소재·부품·장비의 국산화와 수입처 다변화에 나섰다.</w:t>
       </w:r>
     </w:p>
     <w:p>
@@ -328,7 +328,7 @@
           <w:sz w:val="22"/>
           <w:szCs w:val="22"/>
         </w:rPr>
-        <w:t xml:space="preserve">[내용] 마지막으로 인상 깊었던 것은 디지털 세금을 둘러싼 갈등이다. 구글, 애플, 메타, 아마존 같은 글로벌 빅테크 기업들은 세계 곳곳에서 막대한 매출을 올리지만, 물리적 사업장이 없다는 이유로 그 나라에 세금을 거의 내지 않거나, 세율이 낮은 국가로 이익을 옮겨 왔다. 이에 프랑스가 2019년 디지털서비스세를 도입하자 미국은 보복 관세를 경고하며 맞섰다. 결국 OECD를 중심으로 매출이 발생한 국가에 과세권을 나누고, 글로벌 최저한세(15%)를 도입하는 국제 합의가 이루어졌다.</w:t>
+        <w:t xml:space="preserve">[내용] 마지막으로 인상 깊었던 것은 디지털 세금을 둘러싼 갈등이다. 구글, 애플, 메타, 아마존 같은 글로벌 빅테크 기업들은 세계 곳곳에서 막대한 매출을 올리지만, 물리적 사업장이 없다는 이유로 그 나라에 내는 세금이 매우 적거나, 세율이 낮은 국가로 이익을 옮긴다는 비판을 받아 왔다. 이에 프랑스가 2019년 디지털서비스세를 도입하자 미국은 보복 관세를 경고하며 맞섰다. 결국 2021년 OECD를 중심으로 매출이 발생한 국가에 과세권을 나누고, 글로벌 최저한세(15%)를 도입하는 국제 합의가 이루어졌다. 다만 과세권 배분 방안은 아직 제대로 시행되지 못했고 미국이 다시 반발하는 등, 이 싸움은 지금도 진행 중이다.</w:t>
       </w:r>
     </w:p>
     <w:p>
@@ -373,7 +373,7 @@
           <w:sz w:val="22"/>
           <w:szCs w:val="22"/>
         </w:rPr>
-        <w:t xml:space="preserve">[내용] 사건 하나하나 못지않게 인상 깊었던 것은 책의 서술 방식이다. 저자는 경제 전쟁을 승자의 성공담으로 그리지 않는다. 오히려 강대국이 내린 결정이 어떤 오판에서 비롯되었는지, 그 결정의 비용을 누가 치렀는지를 집요하게 따라간다. 또 각 사건을 따로 떼어 설명하지 않고, 앞선 시대의 사건이 뒤 시대의 사건과 어떻게 이어지는지를 보여 주어 수백 년의 역사가 하나의 긴 이야기처럼 읽힌다.</w:t>
+        <w:t xml:space="preserve">[내용] 사건 하나하나 못지않게 인상 깊었던 것은 책의 서술 방식이다. 저자는 경제 전쟁을 승자의 성공담으로 그리지 않는다. 오히려 강대국이 내린 결정이 어떤 오판에서 비롯되었는지, 그 결정의 비용을 누가 치렀는지를 집요하게 따라간다. 그리고 시대 순서대로 사건을 따라가다 보니, 앞선 시대의 갈등이 뒤 시대의 갈등과 닮은꼴로 되풀이된다는 것이 자연스럽게 보여서 수백 년의 역사가 하나의 긴 이야기처럼 읽혔다.</w:t>
       </w:r>
     </w:p>
     <w:p>
@@ -628,22 +628,22 @@
           <w:sz w:val="22"/>
           <w:szCs w:val="22"/>
         </w:rPr>
-        <w:t xml:space="preserve">디지털 세금 전쟁은 공격적인 조세 회피가 장기적으로는 기업의 평판과 규제 환경을 악화시킨다는 것을 보여 준다. 글로벌 최저한세가 도입된 지금, 낮은 세율 국가로 이익을 옮기는 전략의 효과는 점점 줄어들고 있다. 기업은 세금을 단순한 비용이 아니라 사업을 영위하는 사회에 대한 기여로 보고, 투명한 세무 정보 공개와 ESG 경영을 통해 신뢰를 쌓는 편이 더 현명하다. 특히 플랫폼 기업처럼 국경을 넘어 영향력을 행사하는 기업일수록 각국 정부와 시민의 신뢰가 곧 사업의 지속 가능성을 결정한다.</w:t>
-      </w:r>
-    </w:p>
-    <w:p>
-      <w:pPr>
-        <w:spacing w:after="60" w:before="140" w:line="276" w:lineRule="auto"/>
-      </w:pPr>
-      <w:r>
-        <w:rPr>
-          <w:rFonts w:ascii="맑은 고딕" w:cs="맑은 고딕" w:eastAsia="맑은 고딕" w:hAnsi="맑은 고딕"/>
-          <w:b/>
-          <w:bCs/>
-          <w:sz w:val="22"/>
-          <w:szCs w:val="22"/>
-        </w:rPr>
-        <w:t xml:space="preserve">(6) 사례로 생각해 보기 – 가상의 한국 전자부품 기업</w:t>
+        <w:t xml:space="preserve">디지털 세금 전쟁은 공격적인 조세 회피가 장기적으로는 기업의 평판과 규제 환경을 악화시킨다는 것을 보여 준다. 한국을 비롯한 여러 나라가 글로벌 최저한세를 시행하면서, 낮은 세율 국가로 이익을 옮기는 전략의 효과는 점점 줄어들고 있다. 기업은 세금을 단순한 비용이 아니라 사업을 영위하는 사회에 대한 기여로 보고, 투명한 세무 정보 공개와 ESG 경영을 통해 신뢰를 쌓는 편이 더 현명하다. 특히 플랫폼 기업처럼 국경을 넘어 영향력을 행사하는 기업일수록 각국 정부와 시민의 신뢰가 곧 사업의 지속 가능성을 결정한다.</w:t>
+      </w:r>
+    </w:p>
+    <w:p>
+      <w:pPr>
+        <w:spacing w:after="60" w:before="140" w:line="276" w:lineRule="auto"/>
+      </w:pPr>
+      <w:r>
+        <w:rPr>
+          <w:rFonts w:ascii="맑은 고딕" w:cs="맑은 고딕" w:eastAsia="맑은 고딕" w:hAnsi="맑은 고딕"/>
+          <w:b/>
+          <w:bCs/>
+          <w:sz w:val="22"/>
+          <w:szCs w:val="22"/>
+        </w:rPr>
+        <w:t xml:space="preserve">적용 예시 – 가상의 한국 전자부품 기업</w:t>
       </w:r>
     </w:p>
     <w:p>
@@ -793,7 +793,7 @@
           <w:sz w:val="22"/>
           <w:szCs w:val="22"/>
         </w:rPr>
-        <w:t xml:space="preserve">또한 정보를 받아들이는 태도도 달라졌다. 경제 전쟁이 벌어질 때마다 각 나라는 자신의 행동을 "정당한 방어"로, 상대의 행동을 "부당한 공격"으로 설명한다. 책 속 사례에서도 같은 사건이 나라마다 전혀 다르게 해석되었다. 그래서 이제는 한 가지 기사나 한 사람의 주장만 보고 판단하기보다, 상대편의 입장은 어떻게 보도되는지, 숫자와 사실은 무엇인지 따로 확인해 보려고 한다. 특히 인터넷에서 쉽게 퍼지는 자극적인 제목이나 감정적인 주장일수록 한 번 더 의심하고 근거를 찾아보는 습관을 들이게 되었다.</w:t>
+        <w:t xml:space="preserve">또한 정보를 받아들이는 태도도 달라졌다. 경제 전쟁이 벌어질 때마다 각 나라는 자신의 행동을 "정당한 방어"로, 상대의 행동을 "부당한 공격"으로 설명한다. 책 속 사례들을 읽으면서, 같은 사건도 어느 편에 서느냐에 따라 전혀 다르게 보일 수 있다는 것을 느꼈다. 그래서 이제는 한 가지 기사나 한 사람의 주장만 보고 판단하기보다, 상대편의 입장은 어떻게 보도되는지, 숫자와 사실은 무엇인지 따로 확인해 보려고 한다. 특히 인터넷에서 쉽게 퍼지는 자극적인 제목이나 감정적인 주장일수록 한 번 더 의심하고 근거를 찾아보는 습관을 들이게 되었다.</w:t>
       </w:r>
     </w:p>
     <w:p>
@@ -973,7 +973,7 @@
           <w:sz w:val="22"/>
           <w:szCs w:val="22"/>
         </w:rPr>
-        <w:t xml:space="preserve">책을 덮으며 가장 오래 남은 질문은 "그렇다면 경제 전쟁을 막을 방법은 없는가"였다. 책 속의 역사는 그 답이 쉽지 않다는 것을 보여 주지만, 동시에 희망의 단서도 준다. 대공황과 세계대전을 겪은 뒤 각국이 관세를 낮추고 국제 무역 규칙을 만들기 위해 협력했던 것처럼, 경제 전쟁의 상처는 새로운 협력의 계기가 되기도 했다. 디지털 세금 문제를 두고 여러 나라가 끝내 국제 합의를 이끌어 낸 것도 같은 예라고 생각한다. 결국 경제 전쟁을 줄이는 힘은 상대를 이기려는 의지보다, 공동의 규칙을 만들고 지키려는 인내에서 나온다는 것을 배웠다.</w:t>
+        <w:t xml:space="preserve">책을 덮으며 가장 오래 남은 질문은 "그렇다면 경제 전쟁을 막을 방법은 없는가"였다. 책 속의 역사는 그 답이 쉽지 않다는 것을 보여 주지만, 동시에 희망의 단서도 준다. 대공황과 세계대전을 겪은 뒤 각국이 관세 및 무역에 관한 일반협정(GATT)을 맺고 관세를 낮추기 위해 협력했던 것처럼, 경제 전쟁의 상처는 새로운 협력의 계기가 되기도 했다. 디지털 세금 문제를 두고 여러 나라가 갈등 끝에 최저한세라는 공동 규칙에 합의한 것도, 아직 완전하지는 않지만 같은 방향의 예라고 생각한다. 결국 경제 전쟁을 줄이는 힘은 상대를 이기려는 의지보다, 공동의 규칙을 만들고 지키려는 인내에서 나온다는 것을 배웠다.</w:t>
       </w:r>
     </w:p>
     <w:p>

</xml_diff>

<commit_message>
Align book report with the actual table of contents
Add Versailles chapter, match chapter framing and author's conclusion
(mutual free trade), and move the author-perspective item into the summary.

Co-Authored-By: Claude Opus 5.5 <noreply@anthropic.com>
Claude-Session: https://claude.ai/code/session_01QWWxGnXdaFP6TZy6bNqdjA
</commit_message>
<xml_diff>
--- a/경제전쟁의흑역사_독후감.docx
+++ b/경제전쟁의흑역사_독후감.docx
@@ -73,7 +73,7 @@
           <w:sz w:val="22"/>
           <w:szCs w:val="22"/>
         </w:rPr>
-        <w:t xml:space="preserve">전쟁이라고 하면 보통 총과 대포, 무너진 건물 같은 장면이 먼저 떠오른다. 그런데 이 책은 그런 고정관념을 흔든다. 저자 이완배는 15세기 대항해시대부터 오늘날까지 세계사를 뒤흔든 굵직한 경제 전쟁 24가지를 차례로 보여 주면서, 인류의 역사에서 가장 치열하고 오래된 싸움은 사실 "누가 더 많이, 더 싸게, 더 유리하게 사고파느냐"를 둘러싼 싸움이었다고 말한다. 제국주의가 휩쓸던 19세기까지는 그 싸움에 실제로 총칼이 동원되었지만, 시간이 지날수록 경제 전쟁은 시장 쟁탈전, 화폐 전쟁, 무역 전쟁의 모습으로 바뀌었다. 겉으로는 총성이 들리지 않지만, 그 결과는 군사 전쟁 못지않게 한 나라의 흥망을 좌우하고 패권국의 지위를 흔든다.</w:t>
+        <w:t xml:space="preserve">전쟁이라고 하면 보통 총과 대포, 무너진 건물 같은 장면이 먼저 떠오른다. 그런데 이 책은 그런 고정관념을 흔든다. 저자 이완배는 15세기 대항해시대부터 오늘날까지 세계사를 뒤흔든 굵직한 경제 전쟁 24가지를 소개하면서 "과연 경제는 제로섬 게임일까?"라는 질문을 던진다. 책은 두 부분으로 나뉜다. 1부 '뜨거운 전쟁'은 후추 전쟁, 영란전쟁, 아편전쟁, 이라크전쟁처럼 실제로 총칼을 들고 치른 경제 전쟁 12가지를, 2부 '차가운 전쟁'은 스무트-홀리 관세법, 플라자 합의, 한일·미중 무역 분쟁, 디지털 세금 전쟁처럼 총성 없이 벌어진 경제 대결 12가지를 다룬다. 제국주의가 휩쓸던 19세기까지는 그 싸움에 실제로 총칼이 동원되었지만, 시간이 지날수록 경제 전쟁은 시장 쟁탈전, 화폐 전쟁, 무역 전쟁의 모습으로 바뀌었다. 겉으로는 총성이 들리지 않지만, 그 결과는 군사 전쟁 못지않게 한 나라의 흥망을 좌우하고 패권국의 지위를 흔든다.</w:t>
       </w:r>
     </w:p>
     <w:p>
@@ -118,67 +118,112 @@
           <w:sz w:val="22"/>
           <w:szCs w:val="22"/>
         </w:rPr>
-        <w:t xml:space="preserve">(1) 총칼을 앞세운 무역 – 제국주의 시대의 경제 전쟁</w:t>
-      </w:r>
-    </w:p>
-    <w:p>
-      <w:pPr>
-        <w:spacing w:after="80" w:line="276" w:lineRule="auto"/>
-        <w:ind w:firstLine="220"/>
-        <w:jc w:val="both"/>
-      </w:pPr>
-      <w:r>
-        <w:rPr>
-          <w:rFonts w:ascii="맑은 고딕" w:cs="맑은 고딕" w:eastAsia="맑은 고딕" w:hAnsi="맑은 고딕"/>
-          <w:sz w:val="22"/>
-          <w:szCs w:val="22"/>
-        </w:rPr>
-        <w:t xml:space="preserve">[내용] 책은 대항해시대 이후 유럽 강대국들이 무역로와 식민지를 차지하기 위해 벌인 싸움에서 출발한다. 총칼을 앞세운 경제 전쟁의 정점은 19세기 제국주의 시대였다. 대표적인 사례가 영국과 청나라 사이의 아편전쟁이다. 영국은 청에서 차를 대량으로 수입하면서 막대한 은이 빠져나가자, 그 적자를 메우려고 인도산 아편을 청에 밀수출했다. 청이 아편을 몰수해 폐기하자 영국은 군함을 보내 전쟁을 일으켰고, 그 결과 맺어진 난징조약으로 청은 홍콩을 내주고 항구를 강제로 열어야 했다.</w:t>
-      </w:r>
-    </w:p>
-    <w:p>
-      <w:pPr>
-        <w:spacing w:after="80" w:line="276" w:lineRule="auto"/>
-        <w:ind w:firstLine="220"/>
-        <w:jc w:val="both"/>
-      </w:pPr>
-      <w:r>
-        <w:rPr>
-          <w:rFonts w:ascii="맑은 고딕" w:cs="맑은 고딕" w:eastAsia="맑은 고딕" w:hAnsi="맑은 고딕"/>
-          <w:sz w:val="22"/>
-          <w:szCs w:val="22"/>
-        </w:rPr>
-        <w:t xml:space="preserve">[이유] 이 부분이 인상 깊었던 이유는 "자유무역"이라는 말이 언제나 공정한 거래를 뜻하지는 않았다는 점을 처음으로 실감했기 때문이다. 영국은 시장을 열라고 요구하면서 자유무역의 논리를 내세웠지만, 실제로는 상대국 국민의 건강을 해치는 상품을 팔기 위해 무력을 동원했다. 교과서에서 아편전쟁을 배울 때는 단순히 "서양 열강의 침략"으로만 외웠는데, 이 책을 읽고 나니 그 밑바닥에는 무역수지 적자라는 매우 현실적인 경제 문제가 깔려 있었다는 것이 보였다. 전쟁의 원인이 이념이나 명예가 아니라 장부의 숫자였다는 사실이 오히려 더 섬뜩하게 느껴졌다. 동시에, 힘 있는 나라가 규칙을 만들고 그 규칙을 "보편적 원칙"이라 포장한다는 구조가 지금의 국제 경제 질서에서도 크게 달라지지 않았다는 생각이 들었다.</w:t>
-      </w:r>
-    </w:p>
-    <w:p>
-      <w:pPr>
-        <w:spacing w:after="60" w:before="140" w:line="276" w:lineRule="auto"/>
-      </w:pPr>
-      <w:r>
-        <w:rPr>
-          <w:rFonts w:ascii="맑은 고딕" w:cs="맑은 고딕" w:eastAsia="맑은 고딕" w:hAnsi="맑은 고딕"/>
-          <w:b/>
-          <w:bCs/>
-          <w:sz w:val="22"/>
-          <w:szCs w:val="22"/>
-        </w:rPr>
-        <w:t xml:space="preserve">(2) 보호무역이 부른 참사 – 스무트-홀리 관세법</w:t>
-      </w:r>
-    </w:p>
-    <w:p>
-      <w:pPr>
-        <w:spacing w:after="80" w:line="276" w:lineRule="auto"/>
-        <w:ind w:firstLine="220"/>
-        <w:jc w:val="both"/>
-      </w:pPr>
-      <w:r>
-        <w:rPr>
-          <w:rFonts w:ascii="맑은 고딕" w:cs="맑은 고딕" w:eastAsia="맑은 고딕" w:hAnsi="맑은 고딕"/>
-          <w:sz w:val="22"/>
-          <w:szCs w:val="22"/>
-        </w:rPr>
-        <w:t xml:space="preserve">[내용] 1929년 대공황이 시작되자 미국은 자국 산업을 보호하겠다며 1930년 스무트-홀리 관세법을 제정했다. 2만 개가 넘는 수입품에 높은 관세를 매긴 이 법은 미국 역사상 손꼽히게 높은 관세로 알려져 있다. 당시 천 명이 넘는 경제학자들이 대통령에게 거부권 행사를 요청했지만 법은 그대로 시행되었다. 그러자 캐나다와 유럽 여러 나라가 곧바로 보복 관세로 맞섰고, 세계 무역량은 몇 년 사이에 크게 줄어들었다. 미국 제품을 사 주던 해외 시장까지 닫히면서, 이 법은 대공황을 더 깊고 길게 만든 요인 가운데 하나로 꼽힌다.</w:t>
+        <w:t xml:space="preserve">(1) 가장 비열했던 무역 – 아편전쟁</w:t>
+      </w:r>
+    </w:p>
+    <w:p>
+      <w:pPr>
+        <w:spacing w:after="80" w:line="276" w:lineRule="auto"/>
+        <w:ind w:firstLine="220"/>
+        <w:jc w:val="both"/>
+      </w:pPr>
+      <w:r>
+        <w:rPr>
+          <w:rFonts w:ascii="맑은 고딕" w:cs="맑은 고딕" w:eastAsia="맑은 고딕" w:hAnsi="맑은 고딕"/>
+          <w:sz w:val="22"/>
+          <w:szCs w:val="22"/>
+        </w:rPr>
+        <w:t xml:space="preserve">[내용] 1부에서 가장 먼저 마음에 걸린 것은 아편전쟁이다. 산업혁명으로 공장에서 값싼 면직물을 쏟아 내던 영국이었지만, 거대한 인구를 바탕으로 자급자족하던 청에서는 영국 상품이 좀처럼 팔리지 않았다. 반대로 영국은 청에서 차를 대량으로 사들였고, 그 대금으로 막대한 은이 빠져나갔다. 이 무역 적자를 메우려고 영국이 찾아낸 상품이 인도산 아편이었다. 저자는 여기서 한계효용체감의 법칙을 끌어온다. 보통의 상품은 많이 소비할수록 추가로 얻는 만족이 줄어 수요에 한계가 있지만, 중독성 있는 아편은 오히려 더 많이 찾게 만든다. 청이 아편을 몰수해 폐기하자 영국은 군함을 보내 전쟁을 일으켰고, 두 차례의 전쟁 끝에 청은 홍콩을 내주고 항구를 강제로 열며 몰락의 길로 들어섰다. 책은 이를 "무역 적자를 만회하는 가장 비열한 방법"이라고 부른다.</w:t>
+      </w:r>
+    </w:p>
+    <w:p>
+      <w:pPr>
+        <w:spacing w:after="80" w:line="276" w:lineRule="auto"/>
+        <w:ind w:firstLine="220"/>
+        <w:jc w:val="both"/>
+      </w:pPr>
+      <w:r>
+        <w:rPr>
+          <w:rFonts w:ascii="맑은 고딕" w:cs="맑은 고딕" w:eastAsia="맑은 고딕" w:hAnsi="맑은 고딕"/>
+          <w:sz w:val="22"/>
+          <w:szCs w:val="22"/>
+        </w:rPr>
+        <w:t xml:space="preserve">[이유] 이 부분이 인상 깊었던 이유는 "자유무역"이라는 말이 언제나 공정한 거래를 뜻하지는 않았다는 점을 처음으로 실감했기 때문이다. 영국은 시장을 열라고 요구하면서 자유무역의 논리를 내세웠지만, 실제로는 상대국 국민의 건강을 해치는 상품을 팔기 위해 무력을 동원했다. 저자가 "기존의 자유무역은 말만 자유무역이지 실상은 착취의 과정"이었다고 말하는 이유를 이 사례에서 가장 선명하게 확인할 수 있었다. 교과서에서 아편전쟁을 배울 때는 단순히 "서양 열강의 침략"으로만 외웠는데, 이 책을 읽고 나니 그 밑바닥에는 무역수지 적자라는 매우 현실적인 경제 문제가 깔려 있었다는 것이 보였다. 전쟁의 원인이 이념이나 명예가 아니라 장부의 숫자였다는 사실이 오히려 더 섬뜩하게 느껴졌다. 동시에, 힘 있는 나라가 규칙을 만들고 그 규칙을 "보편적 원칙"이라 포장한다는 구조가 지금의 국제 경제 질서에서도 크게 달라지지 않았다는 생각이 들었다.</w:t>
+      </w:r>
+    </w:p>
+    <w:p>
+      <w:pPr>
+        <w:spacing w:after="60" w:before="140" w:line="276" w:lineRule="auto"/>
+      </w:pPr>
+      <w:r>
+        <w:rPr>
+          <w:rFonts w:ascii="맑은 고딕" w:cs="맑은 고딕" w:eastAsia="맑은 고딕" w:hAnsi="맑은 고딕"/>
+          <w:b/>
+          <w:bCs/>
+          <w:sz w:val="22"/>
+          <w:szCs w:val="22"/>
+        </w:rPr>
+        <w:t xml:space="preserve">(2) 승전국의 자살골 – 베르사유조약</w:t>
+      </w:r>
+    </w:p>
+    <w:p>
+      <w:pPr>
+        <w:spacing w:after="80" w:line="276" w:lineRule="auto"/>
+        <w:ind w:firstLine="220"/>
+        <w:jc w:val="both"/>
+      </w:pPr>
+      <w:r>
+        <w:rPr>
+          <w:rFonts w:ascii="맑은 고딕" w:cs="맑은 고딕" w:eastAsia="맑은 고딕" w:hAnsi="맑은 고딕"/>
+          <w:sz w:val="22"/>
+          <w:szCs w:val="22"/>
+        </w:rPr>
+        <w:t xml:space="preserve">[내용] 제1차 세계대전이 끝난 뒤 승전국인 영국과 프랑스는 패전국 독일에 감당하기 어려운 전쟁배상금을 물렸다. 배상금을 갚을 길이 없던 독일은 돈을 마구 찍어 냈고, 1923년에는 물건값이 하루에도 몇 번씩 오를 만큼 극심한 하이퍼인플레이션이 닥쳤다. 저자는 짐바브웨의 살인적인 인플레이션 이야기로 시작해 독일의 사례를 설명한다. 독일 경제가 무너지자 이웃한 프랑스와 유럽 경제도 흔들렸고, 여기에 대공황까지 겹치면서 재기할 힘을 잃은 독일은 히틀러를 지도자로 선택해 제2차 세계대전을 일으켰다.</w:t>
+      </w:r>
+    </w:p>
+    <w:p>
+      <w:pPr>
+        <w:spacing w:after="80" w:line="276" w:lineRule="auto"/>
+        <w:ind w:firstLine="220"/>
+        <w:jc w:val="both"/>
+      </w:pPr>
+      <w:r>
+        <w:rPr>
+          <w:rFonts w:ascii="맑은 고딕" w:cs="맑은 고딕" w:eastAsia="맑은 고딕" w:hAnsi="맑은 고딕"/>
+          <w:sz w:val="22"/>
+          <w:szCs w:val="22"/>
+        </w:rPr>
+        <w:t xml:space="preserve">[이유] 이 장이 인상 깊었던 것은 감정이 경제 정책을 결정할 때 얼마나 위험한지 보여 주었기 때문이다. 영국과 프랑스는 원수를 짓밟았다는 쾌감을 잠깐 누렸지만, 그 대가로 유럽의 시장 질서가 무너지고 더 큰 전쟁을 맞았다. 책의 "독일을 짓밟은 쾌감도 잠시, 서유럽의 자살골"이라는 표현이 정확했다. 상대를 완전히 무너뜨리면 내가 이긴 것 같지만, 경제는 서로 연결되어 있어서 이웃의 몰락은 결국 나의 손해로 돌아온다. 이는 오늘날 무역 분쟁에서 상대를 굴복시키겠다며 보복을 주고받는 모습과도 겹쳐 보였다. 또 하이퍼인플레이션 부분을 읽으며, 화폐의 가치는 종이 자체가 아니라 그 나라 경제에 대한 믿음에서 나온다는 사실을 실감했다.</w:t>
+      </w:r>
+    </w:p>
+    <w:p>
+      <w:pPr>
+        <w:spacing w:after="60" w:before="140" w:line="276" w:lineRule="auto"/>
+      </w:pPr>
+      <w:r>
+        <w:rPr>
+          <w:rFonts w:ascii="맑은 고딕" w:cs="맑은 고딕" w:eastAsia="맑은 고딕" w:hAnsi="맑은 고딕"/>
+          <w:b/>
+          <w:bCs/>
+          <w:sz w:val="22"/>
+          <w:szCs w:val="22"/>
+        </w:rPr>
+        <w:t xml:space="preserve">(3) 보호무역이 부른 참사 – 스무트-홀리 관세법</w:t>
+      </w:r>
+    </w:p>
+    <w:p>
+      <w:pPr>
+        <w:spacing w:after="80" w:line="276" w:lineRule="auto"/>
+        <w:ind w:firstLine="220"/>
+        <w:jc w:val="both"/>
+      </w:pPr>
+      <w:r>
+        <w:rPr>
+          <w:rFonts w:ascii="맑은 고딕" w:cs="맑은 고딕" w:eastAsia="맑은 고딕" w:hAnsi="맑은 고딕"/>
+          <w:sz w:val="22"/>
+          <w:szCs w:val="22"/>
+        </w:rPr>
+        <w:t xml:space="preserve">[내용] 1929년 대공황이 시작되자 미국은 자국 산업을 보호하겠다며 1930년 스무트-홀리 관세법을 제정했다. 2만 개가 넘는 수입품에 높은 관세를 매긴 이 법은 미국 역사상 손꼽히게 높은 관세로 알려져 있다. 당시 천 명이 넘는 경제학자들이 대통령에게 거부권 행사를 요청했지만 법은 그대로 시행되었다. 그러자 캐나다와 유럽 여러 나라가 곧바로 보복 관세로 맞섰고, 세계 무역량은 몇 년 사이에 크게 줄어들었다. 미국 제품을 사 주던 해외 시장까지 닫히면서, 이 법은 대공황을 더 깊고 길게 만든 요인 가운데 하나로 꼽힌다. 저자는 이를 "불타는 경제에 기름을 끼얹은" 결정이라고 표현한다.</w:t>
       </w:r>
     </w:p>
     <w:p>
@@ -208,127 +253,127 @@
           <w:sz w:val="22"/>
           <w:szCs w:val="22"/>
         </w:rPr>
-        <w:t xml:space="preserve">(3) 총성 없는 화폐 전쟁 – 플라자 합의와 일본 경제</w:t>
-      </w:r>
-    </w:p>
-    <w:p>
-      <w:pPr>
-        <w:spacing w:after="80" w:line="276" w:lineRule="auto"/>
-        <w:ind w:firstLine="220"/>
-        <w:jc w:val="both"/>
-      </w:pPr>
-      <w:r>
-        <w:rPr>
-          <w:rFonts w:ascii="맑은 고딕" w:cs="맑은 고딕" w:eastAsia="맑은 고딕" w:hAnsi="맑은 고딕"/>
-          <w:sz w:val="22"/>
-          <w:szCs w:val="22"/>
-        </w:rPr>
-        <w:t xml:space="preserve">[내용] 1980년대 미국은 막대한 무역 적자에 시달렸고, 그 상대편에는 무섭게 성장하던 일본이 있었다. 1985년 9월, 미국·일본·서독·영국·프랑스의 재무장관과 중앙은행 총재들이 뉴욕 플라자 호텔에 모여 달러 가치를 낮추기로 합의했다. 이른바 플라자 합의다. 이후 엔화 가치는 급격히 올라 불과 2년여 만에 달러 대비 두 배 가까이 뛰었다. 엔고로 인한 불황을 걱정한 일본은 기준금리를 크게 낮추었고, 풀린 돈은 부동산과 주식으로 몰려 거대한 거품을 만들었다. 1990년대 초 거품이 꺼지자 일본은 "잃어버린 10년", 나아가 "잃어버린 20년"이라 불리는 긴 침체에 빠졌다.</w:t>
-      </w:r>
-    </w:p>
-    <w:p>
-      <w:pPr>
-        <w:spacing w:after="80" w:line="276" w:lineRule="auto"/>
-        <w:ind w:firstLine="220"/>
-        <w:jc w:val="both"/>
-      </w:pPr>
-      <w:r>
-        <w:rPr>
-          <w:rFonts w:ascii="맑은 고딕" w:cs="맑은 고딕" w:eastAsia="맑은 고딕" w:hAnsi="맑은 고딕"/>
-          <w:sz w:val="22"/>
-          <w:szCs w:val="22"/>
-        </w:rPr>
-        <w:t xml:space="preserve">[이유] 이 부분은 경제 전쟁이 반드시 관세나 무력으로만 벌어지는 것이 아니라, 회의실에서 서명 한 번으로도 치러질 수 있다는 것을 보여 주어 충격적이었다. 한 방의 총알도 발사되지 않았지만 세계 2위 경제 대국의 미래가 크게 바뀌었다. 더 흥미로웠던 점은 일본의 몰락이 합의 그 자체보다, 그 충격에 대응하는 과정에서의 정책 실패와 과도한 낙관에서 비롯되었다는 해석이었다. 외부의 충격은 피할 수 없어도, 그 충격에 어떻게 대응하느냐는 스스로 선택할 수 있다. 나는 이 대목에서 개인에게도 같은 교훈이 적용된다고 느꼈다. 예상치 못한 위기가 닥쳤을 때 조급하게 쉬운 해법에 기대면 더 큰 문제를 만든다는 것이다. 또한 같은 시기 한국이 이른바 "3저 호황"으로 수출 호황을 누렸다는 점을 떠올리며, 강대국 간 경제 전쟁의 파장이 제3국에 기회가 되기도 하고 위기가 되기도 한다는 사실도 새삼 깨달았다.</w:t>
-      </w:r>
-    </w:p>
-    <w:p>
-      <w:pPr>
-        <w:spacing w:after="60" w:before="140" w:line="276" w:lineRule="auto"/>
-      </w:pPr>
-      <w:r>
-        <w:rPr>
-          <w:rFonts w:ascii="맑은 고딕" w:cs="맑은 고딕" w:eastAsia="맑은 고딕" w:hAnsi="맑은 고딕"/>
-          <w:b/>
-          <w:bCs/>
-          <w:sz w:val="22"/>
-          <w:szCs w:val="22"/>
-        </w:rPr>
-        <w:t xml:space="preserve">(4) 오늘의 경제 전쟁 – 미중 무역 분쟁과 한일 무역 분쟁</w:t>
-      </w:r>
-    </w:p>
-    <w:p>
-      <w:pPr>
-        <w:spacing w:after="80" w:line="276" w:lineRule="auto"/>
-        <w:ind w:firstLine="220"/>
-        <w:jc w:val="both"/>
-      </w:pPr>
-      <w:r>
-        <w:rPr>
-          <w:rFonts w:ascii="맑은 고딕" w:cs="맑은 고딕" w:eastAsia="맑은 고딕" w:hAnsi="맑은 고딕"/>
-          <w:sz w:val="22"/>
-          <w:szCs w:val="22"/>
-        </w:rPr>
-        <w:t xml:space="preserve">[내용] 책은 우리가 뉴스로 직접 지켜본 최근의 사건들까지 다룬다. 2018년 본격화한 미중 무역 분쟁은 서로의 수입품에 관세를 주고받는 데서 시작해, 화웨이 제재와 첨단 반도체 수출 통제로 번지며 기술 패권 경쟁으로 확대되었다. 한국과 일본 사이에서도 2019년 일본이 반도체 핵심 소재 3개 품목(불화수소, 포토레지스트, 플루오린 폴리이미드)의 수출을 규제하고 한국을 이른바 화이트리스트에서 제외하면서 무역 분쟁이 벌어졌다. 한국에서는 일본 제품 불매 운동이 일어났고, 정부와 기업은 소재·부품·장비의 국산화와 수입처 다변화에 나섰다.</w:t>
-      </w:r>
-    </w:p>
-    <w:p>
-      <w:pPr>
-        <w:spacing w:after="80" w:line="276" w:lineRule="auto"/>
-        <w:ind w:firstLine="220"/>
-        <w:jc w:val="both"/>
-      </w:pPr>
-      <w:r>
-        <w:rPr>
-          <w:rFonts w:ascii="맑은 고딕" w:cs="맑은 고딕" w:eastAsia="맑은 고딕" w:hAnsi="맑은 고딕"/>
-          <w:sz w:val="22"/>
-          <w:szCs w:val="22"/>
-        </w:rPr>
-        <w:t xml:space="preserve">[이유] 앞의 사건들이 "역사"로 읽혔다면, 이 부분은 "지금 내가 살고 있는 현실"로 읽혀서 더 인상 깊었다. 특히 한일 무역 분쟁은 내가 직접 기억하는 일이라서, 당시 뉴스에서 들었던 단편적인 정보들이 책을 통해 하나의 흐름으로 연결되는 경험을 했다. 경제 전쟁의 무기가 관세에서 기술과 핵심 소재로 옮겨 갔다는 점이 가장 중요하게 다가왔다. 과거에는 상대국의 물건을 막는 것이 무기였다면, 이제는 상대국이 반드시 필요로 하는 것을 주지 않는 것이 무기가 된다. 이는 세계화가 만든 촘촘한 공급망이 효율성의 상징이면서 동시에 약점이 될 수 있음을 뜻한다. 또한 위기를 계기로 한국 기업들이 일부 소재의 국산화에 성과를 냈다는 점에서, 경제 전쟁이 반드시 피해만 남기는 것이 아니라 체질을 바꾸는 계기가 될 수도 있다는 점도 흥미로웠다.</w:t>
-      </w:r>
-    </w:p>
-    <w:p>
-      <w:pPr>
-        <w:spacing w:after="80" w:line="276" w:lineRule="auto"/>
-        <w:ind w:firstLine="220"/>
-        <w:jc w:val="both"/>
-      </w:pPr>
-      <w:r>
-        <w:rPr>
-          <w:rFonts w:ascii="맑은 고딕" w:cs="맑은 고딕" w:eastAsia="맑은 고딕" w:hAnsi="맑은 고딕"/>
-          <w:sz w:val="22"/>
-          <w:szCs w:val="22"/>
-        </w:rPr>
-        <w:t xml:space="preserve">특히 반도체를 둘러싼 경쟁은 한국과 직접 맞닿아 있어 더 무겁게 읽혔다. 미국은 첨단 반도체와 제조 장비의 대중국 수출을 통제하는 한편, 자국 내 반도체 공장 건설에 막대한 보조금을 주는 정책을 펼쳤다. 중국은 이에 맞서 자체 기술 개발과 핵심 광물 수출 관리로 대응했다. 이 과정에서 두 나라 모두와 깊이 얽힌 한국 기업들은 어느 한쪽을 선택하기 어려운 처지에 놓였다. 책을 읽으며, 경제 전쟁의 당사자가 아닌 나라도 거대한 두 세력 사이에서 언제든 피해자가 될 수 있고, 그렇기 때문에 "대체할 수 없는 기술"을 가지는 것이 작은 나라가 가질 수 있는 가장 강력한 방패라는 생각이 들었다.</w:t>
-      </w:r>
-    </w:p>
-    <w:p>
-      <w:pPr>
-        <w:spacing w:after="60" w:before="140" w:line="276" w:lineRule="auto"/>
-      </w:pPr>
-      <w:r>
-        <w:rPr>
-          <w:rFonts w:ascii="맑은 고딕" w:cs="맑은 고딕" w:eastAsia="맑은 고딕" w:hAnsi="맑은 고딕"/>
-          <w:b/>
-          <w:bCs/>
-          <w:sz w:val="22"/>
-          <w:szCs w:val="22"/>
-        </w:rPr>
-        <w:t xml:space="preserve">(5) 국경 없는 기업과의 싸움 – 디지털 세금 전쟁</w:t>
-      </w:r>
-    </w:p>
-    <w:p>
-      <w:pPr>
-        <w:spacing w:after="80" w:line="276" w:lineRule="auto"/>
-        <w:ind w:firstLine="220"/>
-        <w:jc w:val="both"/>
-      </w:pPr>
-      <w:r>
-        <w:rPr>
-          <w:rFonts w:ascii="맑은 고딕" w:cs="맑은 고딕" w:eastAsia="맑은 고딕" w:hAnsi="맑은 고딕"/>
-          <w:sz w:val="22"/>
-          <w:szCs w:val="22"/>
-        </w:rPr>
-        <w:t xml:space="preserve">[내용] 마지막으로 인상 깊었던 것은 디지털 세금을 둘러싼 갈등이다. 구글, 애플, 메타, 아마존 같은 글로벌 빅테크 기업들은 세계 곳곳에서 막대한 매출을 올리지만, 물리적 사업장이 없다는 이유로 그 나라에 내는 세금이 매우 적거나, 세율이 낮은 국가로 이익을 옮긴다는 비판을 받아 왔다. 이에 프랑스가 2019년 디지털서비스세를 도입하자 미국은 보복 관세를 경고하며 맞섰다. 결국 2021년 OECD를 중심으로 매출이 발생한 국가에 과세권을 나누고, 글로벌 최저한세(15%)를 도입하는 국제 합의가 이루어졌다. 다만 과세권 배분 방안은 아직 제대로 시행되지 못했고 미국이 다시 반발하는 등, 이 싸움은 지금도 진행 중이다.</w:t>
+        <w:t xml:space="preserve">(4) 총성 없는 화폐 전쟁 – 플라자 합의와 일본 경제</w:t>
+      </w:r>
+    </w:p>
+    <w:p>
+      <w:pPr>
+        <w:spacing w:after="80" w:line="276" w:lineRule="auto"/>
+        <w:ind w:firstLine="220"/>
+        <w:jc w:val="both"/>
+      </w:pPr>
+      <w:r>
+        <w:rPr>
+          <w:rFonts w:ascii="맑은 고딕" w:cs="맑은 고딕" w:eastAsia="맑은 고딕" w:hAnsi="맑은 고딕"/>
+          <w:sz w:val="22"/>
+          <w:szCs w:val="22"/>
+        </w:rPr>
+        <w:t xml:space="preserve">[내용] 1980년대 미국은 막대한 무역 적자에 시달렸고, 그 상대편에는 무섭게 성장하던 일본이 있었다. 1985년 9월, 미국·일본·서독·영국·프랑스의 재무장관과 중앙은행 총재들이 뉴욕 플라자 호텔에 모여 달러 가치를 낮추기로 합의했다. 이른바 플라자 합의로, 책의 표현을 빌리면 미국이 "경제 대국을 꿈꾼 일본의 야망을 꺾은" 사건이다. 이후 엔화 가치는 급격히 올라 불과 2년여 만에 달러 대비 두 배 가까이 뛰었다. 엔고로 인한 불황을 걱정한 일본은 기준금리를 크게 낮추었고, 풀린 돈은 부동산과 주식으로 몰려 거대한 거품을 만들었다. 1990년대 초 거품이 꺼지자 일본은 "잃어버린 10년", 나아가 "잃어버린 20년"이라 불리는 긴 침체에 빠졌다.</w:t>
+      </w:r>
+    </w:p>
+    <w:p>
+      <w:pPr>
+        <w:spacing w:after="80" w:line="276" w:lineRule="auto"/>
+        <w:ind w:firstLine="220"/>
+        <w:jc w:val="both"/>
+      </w:pPr>
+      <w:r>
+        <w:rPr>
+          <w:rFonts w:ascii="맑은 고딕" w:cs="맑은 고딕" w:eastAsia="맑은 고딕" w:hAnsi="맑은 고딕"/>
+          <w:sz w:val="22"/>
+          <w:szCs w:val="22"/>
+        </w:rPr>
+        <w:t xml:space="preserve">[이유] 이 부분은 경제 전쟁이 반드시 관세나 무력으로만 벌어지는 것이 아니라, 회의실에서 서명 한 번으로도 치러질 수 있다는 것을 보여 주어 충격적이었다. 한 방의 총알도 발사되지 않았지만 세계 2위 경제 대국의 미래가 크게 바뀌었다. 바로 앞 장의 스미스소니언협정에서 달러가 기축통화가 된 과정을 읽은 덕분에, 미국이 환율을 무기로 쓸 수 있었던 힘이 기축통화에서 나온다는 점도 이해할 수 있었다. 책을 읽고 관련 자료를 더 찾아보니, 일본의 몰락이 합의 그 자체뿐 아니라 그 충격에 대응하는 과정의 정책 실패와 과도한 낙관에서도 비롯되었다는 분석이 있다는 것을 알게 되었다. 외부의 충격은 피할 수 없어도, 그 충격에 어떻게 대응하느냐는 스스로 선택할 수 있다. 나는 이 대목에서 개인에게도 같은 교훈이 적용된다고 느꼈다. 예상치 못한 위기가 닥쳤을 때 조급하게 쉬운 해법에 기대면 더 큰 문제를 만든다는 것이다. 또한 같은 시기 한국이 이른바 "3저 호황"으로 수출 호황을 누렸다는 점을 떠올리며, 강대국 간 경제 전쟁의 파장이 제3국에 기회가 되기도 하고 위기가 되기도 한다는 사실도 새삼 깨달았다.</w:t>
+      </w:r>
+    </w:p>
+    <w:p>
+      <w:pPr>
+        <w:spacing w:after="60" w:before="140" w:line="276" w:lineRule="auto"/>
+      </w:pPr>
+      <w:r>
+        <w:rPr>
+          <w:rFonts w:ascii="맑은 고딕" w:cs="맑은 고딕" w:eastAsia="맑은 고딕" w:hAnsi="맑은 고딕"/>
+          <w:b/>
+          <w:bCs/>
+          <w:sz w:val="22"/>
+          <w:szCs w:val="22"/>
+        </w:rPr>
+        <w:t xml:space="preserve">(5) 오늘의 경제 전쟁 – 한일 무역 분쟁과 미중 무역 분쟁</w:t>
+      </w:r>
+    </w:p>
+    <w:p>
+      <w:pPr>
+        <w:spacing w:after="80" w:line="276" w:lineRule="auto"/>
+        <w:ind w:firstLine="220"/>
+        <w:jc w:val="both"/>
+      </w:pPr>
+      <w:r>
+        <w:rPr>
+          <w:rFonts w:ascii="맑은 고딕" w:cs="맑은 고딕" w:eastAsia="맑은 고딕" w:hAnsi="맑은 고딕"/>
+          <w:sz w:val="22"/>
+          <w:szCs w:val="22"/>
+        </w:rPr>
+        <w:t xml:space="preserve">[내용] 2부의 후반부는 우리가 뉴스로 직접 지켜본 사건들을 다룬다. 2019년 일본은 반도체 핵심 소재 3개 품목(불화수소, 포토레지스트, 플루오린 폴리이미드)의 한국 수출을 규제하고, 한국을 이른바 화이트리스트에서 제외했다. 그러나 한국 기업들이 수입처를 다변화하고 소재·부품·장비의 국산화에 나서면서, 규제의 칼끝은 오히려 일본 소재 기업들을 향하게 되었다. 저자는 이를 두고 일본이 "잘못 긁어서 부스럼을 만들었다", 선진국의 강점인 자유무역을 스스로 걷어찼다고 평가한다. 2010년 영토 분쟁 중 중국이 일본에 희토류 수출을 막았다가 결국 그 무기가 힘을 잃은 희토류 분쟁도 같은 흐름에 있다. 미중 무역 분쟁은 2018년 트럼프 행정부가 중국산 제품에 고율 관세를 매기고 중국이 보복 관세로 맞서면서 본격화했다. 저자는 끝까지 물러서지 않던 두 나라의 모습을 치킨 게임에, 그리고 "내가 무슨 짓을 할지 몰라"라는 신호로 상대를 겁주는 방식을 미치광이 전략에 비유한다.</w:t>
+      </w:r>
+    </w:p>
+    <w:p>
+      <w:pPr>
+        <w:spacing w:after="80" w:line="276" w:lineRule="auto"/>
+        <w:ind w:firstLine="220"/>
+        <w:jc w:val="both"/>
+      </w:pPr>
+      <w:r>
+        <w:rPr>
+          <w:rFonts w:ascii="맑은 고딕" w:cs="맑은 고딕" w:eastAsia="맑은 고딕" w:hAnsi="맑은 고딕"/>
+          <w:sz w:val="22"/>
+          <w:szCs w:val="22"/>
+        </w:rPr>
+        <w:t xml:space="preserve">[이유] 앞의 사건들이 "역사"로 읽혔다면, 이 부분은 "지금 내가 살고 있는 현실"로 읽혀서 더 인상 깊었다. 특히 한일 무역 분쟁은 내가 직접 기억하는 일이라서, 당시 뉴스에서 들었던 단편적인 정보들이 책을 통해 하나의 흐름으로 연결되는 경험을 했다. 치킨 게임 비유도 특히 와닿았다. 미치광이 전략은 상대가 겁을 먹을 때만 통하고, 두 나라가 모두 같은 전략을 쓰면 결국 외길에서 충돌해 함께 망하게 된다. 또 경제 전쟁의 무기가 관세에서 기술과 핵심 소재로 옮겨 갔다는 점이 중요하게 다가왔다. 과거에는 상대국의 물건을 막는 것이 무기였다면, 이제는 상대국이 반드시 필요로 하는 것을 주지 않는 것이 무기가 된다. 이는 세계화가 만든 촘촘한 공급망이 효율성의 상징이면서 동시에 약점이 될 수 있음을 뜻한다. 또한 위기를 계기로 한국 기업들이 일부 소재의 국산화에 성과를 냈다는 점에서, 경제 전쟁이 반드시 피해만 남기는 것이 아니라 체질을 바꾸는 계기가 될 수도 있다는 점도 흥미로웠다.</w:t>
+      </w:r>
+    </w:p>
+    <w:p>
+      <w:pPr>
+        <w:spacing w:after="80" w:line="276" w:lineRule="auto"/>
+        <w:ind w:firstLine="220"/>
+        <w:jc w:val="both"/>
+      </w:pPr>
+      <w:r>
+        <w:rPr>
+          <w:rFonts w:ascii="맑은 고딕" w:cs="맑은 고딕" w:eastAsia="맑은 고딕" w:hAnsi="맑은 고딕"/>
+          <w:sz w:val="22"/>
+          <w:szCs w:val="22"/>
+        </w:rPr>
+        <w:t xml:space="preserve">책을 덮은 뒤 지금의 상황을 떠올려 보니, 책에서 다룬 관세 전쟁은 반도체를 둘러싼 기술 전쟁으로까지 번져 있었다. 이 경쟁은 한국과 직접 맞닿아 있어 더 무겁게 느껴졌다. 미국은 첨단 반도체와 제조 장비의 대중국 수출을 통제하는 한편, 자국 내 반도체 공장 건설에 막대한 보조금을 주는 정책을 펼쳤다. 중국은 이에 맞서 자체 기술 개발과 핵심 광물 수출 관리로 대응했다. 이 과정에서 두 나라 모두와 깊이 얽힌 한국 기업들은 어느 한쪽을 선택하기 어려운 처지에 놓였다. 책을 읽으며, 경제 전쟁의 당사자가 아닌 나라도 거대한 두 세력 사이에서 언제든 피해자가 될 수 있고, 그렇기 때문에 "대체할 수 없는 기술"을 가지는 것이 작은 나라가 가질 수 있는 가장 강력한 방패라는 생각이 들었다.</w:t>
+      </w:r>
+    </w:p>
+    <w:p>
+      <w:pPr>
+        <w:spacing w:after="60" w:before="140" w:line="276" w:lineRule="auto"/>
+      </w:pPr>
+      <w:r>
+        <w:rPr>
+          <w:rFonts w:ascii="맑은 고딕" w:cs="맑은 고딕" w:eastAsia="맑은 고딕" w:hAnsi="맑은 고딕"/>
+          <w:b/>
+          <w:bCs/>
+          <w:sz w:val="22"/>
+          <w:szCs w:val="22"/>
+        </w:rPr>
+        <w:t xml:space="preserve">(6) 국경 없는 기업과의 싸움 – 디지털 세금 전쟁</w:t>
+      </w:r>
+    </w:p>
+    <w:p>
+      <w:pPr>
+        <w:spacing w:after="80" w:line="276" w:lineRule="auto"/>
+        <w:ind w:firstLine="220"/>
+        <w:jc w:val="both"/>
+      </w:pPr>
+      <w:r>
+        <w:rPr>
+          <w:rFonts w:ascii="맑은 고딕" w:cs="맑은 고딕" w:eastAsia="맑은 고딕" w:hAnsi="맑은 고딕"/>
+          <w:sz w:val="22"/>
+          <w:szCs w:val="22"/>
+        </w:rPr>
+        <w:t xml:space="preserve">[내용] 마지막으로 인상 깊었던 것은 책의 맨 끝 장인 디지털 세금 전쟁, 이른바 구글세 논란이다. 구글, 애플, 메타, 아마존 같은 글로벌 빅테크 기업들은 세계 곳곳에서 막대한 매출을 올리지만, 물리적 사업장이 없다는 이유로 그 나라에 내는 세금이 매우 적거나, 세율이 낮은 국가로 이익을 옮긴다는 비판을 받아 왔다. 이에 프랑스가 2019년 디지털서비스세를 도입하자 미국은 보복 관세를 경고하며 맞섰다. 그런데 뜻밖에도 2021년 미국이 먼저 글로벌 최저한세를 제안하고 나서면서, OECD를 중심으로 매출이 발생한 국가에 과세권을 나누고, 글로벌 최저한세(15%)를 도입하는 국제 합의가 이루어졌다. 다만 과세권 배분 방안은 아직 제대로 시행되지 못했고 미국이 다시 반발하는 등, 이 싸움은 지금도 진행 중이다.</w:t>
       </w:r>
     </w:p>
     <w:p>
@@ -358,67 +403,52 @@
           <w:sz w:val="22"/>
           <w:szCs w:val="22"/>
         </w:rPr>
-        <w:t xml:space="preserve">(6) 역사를 "흑역사"로 기록하는 저자의 시선</w:t>
-      </w:r>
-    </w:p>
-    <w:p>
-      <w:pPr>
-        <w:spacing w:after="80" w:line="276" w:lineRule="auto"/>
-        <w:ind w:firstLine="220"/>
-        <w:jc w:val="both"/>
-      </w:pPr>
-      <w:r>
-        <w:rPr>
-          <w:rFonts w:ascii="맑은 고딕" w:cs="맑은 고딕" w:eastAsia="맑은 고딕" w:hAnsi="맑은 고딕"/>
-          <w:sz w:val="22"/>
-          <w:szCs w:val="22"/>
-        </w:rPr>
-        <w:t xml:space="preserve">[내용] 사건 하나하나 못지않게 인상 깊었던 것은 책의 서술 방식이다. 저자는 경제 전쟁을 승자의 성공담으로 그리지 않는다. 오히려 강대국이 내린 결정이 어떤 오판에서 비롯되었는지, 그 결정의 비용을 누가 치렀는지를 집요하게 따라간다. 그리고 시대 순서대로 사건을 따라가다 보니, 앞선 시대의 갈등이 뒤 시대의 갈등과 닮은꼴로 되풀이된다는 것이 자연스럽게 보여서 수백 년의 역사가 하나의 긴 이야기처럼 읽혔다.</w:t>
-      </w:r>
-    </w:p>
-    <w:p>
-      <w:pPr>
-        <w:spacing w:after="80" w:line="276" w:lineRule="auto"/>
-        <w:ind w:firstLine="220"/>
-        <w:jc w:val="both"/>
-      </w:pPr>
-      <w:r>
-        <w:rPr>
-          <w:rFonts w:ascii="맑은 고딕" w:cs="맑은 고딕" w:eastAsia="맑은 고딕" w:hAnsi="맑은 고딕"/>
-          <w:sz w:val="22"/>
-          <w:szCs w:val="22"/>
-        </w:rPr>
-        <w:t xml:space="preserve">[이유] 우리는 흔히 역사를 성공한 사람과 나라의 이야기로 배운다. 그런데 이 책은 실패의 기록에서 더 많은 것을 배울 수 있다는 것을 보여 주었다. 성공 사례는 운이나 시대적 조건이 크게 작용해 그대로 따라 하기 어렵지만, 실패 사례는 "무엇을 하지 말아야 하는지"를 비교적 분명하게 알려 준다. 또한 책을 읽으며 저자의 해석을 무조건 받아들이기보다 다른 시각은 없는지 스스로 질문하게 되었다. 예를 들어 보호무역이 언제나 실패만 낳았는지, 산업 초기 단계의 나라에게는 일정한 보호가 필요한 것은 아닌지 같은 의문이다. 한국 역시 경제 개발 초기에 일부 산업을 보호하며 성장한 경험이 있기 때문이다. 이렇게 책의 주장과 나의 의문을 나란히 놓고 생각해 보는 과정 자체가 이번 독서에서 얻은 중요한 경험이었다.</w:t>
-      </w:r>
-    </w:p>
-    <w:p>
-      <w:pPr>
-        <w:spacing w:after="60" w:before="140" w:line="276" w:lineRule="auto"/>
-      </w:pPr>
-      <w:r>
-        <w:rPr>
-          <w:rFonts w:ascii="맑은 고딕" w:cs="맑은 고딕" w:eastAsia="맑은 고딕" w:hAnsi="맑은 고딕"/>
-          <w:b/>
-          <w:bCs/>
-          <w:sz w:val="22"/>
-          <w:szCs w:val="22"/>
-        </w:rPr>
-        <w:t xml:space="preserve">종합 – 책 전체를 관통하는 메시지</w:t>
-      </w:r>
-    </w:p>
-    <w:p>
-      <w:pPr>
-        <w:spacing w:after="80" w:line="276" w:lineRule="auto"/>
-        <w:ind w:firstLine="220"/>
-        <w:jc w:val="both"/>
-      </w:pPr>
-      <w:r>
-        <w:rPr>
-          <w:rFonts w:ascii="맑은 고딕" w:cs="맑은 고딕" w:eastAsia="맑은 고딕" w:hAnsi="맑은 고딕"/>
-          <w:sz w:val="22"/>
-          <w:szCs w:val="22"/>
-        </w:rPr>
-        <w:t xml:space="preserve">여섯 가지 이야기를 되짚어 보면 하나의 공통점이 보인다. 경제 전쟁에서 완전한 승자는 거의 없다는 것이다. 관세로 문을 걸어 잠근 나라는 수출 시장을 잃었고, 환율 전쟁의 충격을 잘못 다룬 나라는 긴 침체에 빠졌으며, 무력으로 시장을 연 나라도 결국 역사의 심판을 피하지 못했다. 저자가 자유무역과 보호무역 사이의 오랜 갈등을 추적하면서 보여 주는 것은 어느 한쪽이 절대적으로 옳다는 결론이 아니라, 상대를 무너뜨리려는 극단적인 선택이 결국 자신에게 돌아온다는 교훈이라고 생각한다.</w:t>
+        <w:t xml:space="preserve">종합 – 저자가 말하는 해법, 상생의 자유무역</w:t>
+      </w:r>
+    </w:p>
+    <w:p>
+      <w:pPr>
+        <w:spacing w:after="80" w:line="276" w:lineRule="auto"/>
+        <w:ind w:firstLine="220"/>
+        <w:jc w:val="both"/>
+      </w:pPr>
+      <w:r>
+        <w:rPr>
+          <w:rFonts w:ascii="맑은 고딕" w:cs="맑은 고딕" w:eastAsia="맑은 고딕" w:hAnsi="맑은 고딕"/>
+          <w:sz w:val="22"/>
+          <w:szCs w:val="22"/>
+        </w:rPr>
+        <w:t xml:space="preserve">여섯 가지 이야기를 되짚어 보면 하나의 공통점이 보인다. 경제 전쟁에서 완전한 승자는 거의 없다는 것이다. 무력으로 시장을 연 나라는 역사의 심판을 피하지 못했고, 이웃을 짓밟은 승전국은 더 큰 전쟁을 맞았으며, 관세로 문을 걸어 잠근 나라는 수출 시장을 잃었고, 환율 전쟁의 충격을 잘못 다룬 나라는 긴 침체에 빠졌다. 출판사 소개의 말처럼 이 책은 "극단적 경제 대결의 승자는 있을 수 없다"는 메시지를 전한다.</w:t>
+      </w:r>
+    </w:p>
+    <w:p>
+      <w:pPr>
+        <w:spacing w:after="80" w:line="276" w:lineRule="auto"/>
+        <w:ind w:firstLine="220"/>
+        <w:jc w:val="both"/>
+      </w:pPr>
+      <w:r>
+        <w:rPr>
+          <w:rFonts w:ascii="맑은 고딕" w:cs="맑은 고딕" w:eastAsia="맑은 고딕" w:hAnsi="맑은 고딕"/>
+          <w:sz w:val="22"/>
+          <w:szCs w:val="22"/>
+        </w:rPr>
+        <w:t xml:space="preserve">그렇다고 저자가 어느 한쪽 편을 드는 것은 아니다. 분업을 기반으로 한 자유무역은 효율을 높이지만, 지금까지의 자유무역은 선진국과 후발 주자 사이의 격차를 벌리고 굳히는 경우가 많았다. 반대로 보호무역을 택하면 분업이 주는 막대한 효율을 포기해야 한다. 그래서 저자가 내놓는 답은 "서로를 죽이지 않는 자유무역, 호혜와 평등을 기반으로 한 상생의 자유무역"이다. 대륙봉쇄령을 다룬 장에서 후발국 독일의 입장에서 보호무역을 옹호한 프리드리히 리스트를 소개하는 것도, 힘센 나라의 자유무역만이 정답은 아니라는 점을 보여 주기 위해서라고 느꼈다.</w:t>
+      </w:r>
+    </w:p>
+    <w:p>
+      <w:pPr>
+        <w:spacing w:after="80" w:line="276" w:lineRule="auto"/>
+        <w:ind w:firstLine="220"/>
+        <w:jc w:val="both"/>
+      </w:pPr>
+      <w:r>
+        <w:rPr>
+          <w:rFonts w:ascii="맑은 고딕" w:cs="맑은 고딕" w:eastAsia="맑은 고딕" w:hAnsi="맑은 고딕"/>
+          <w:sz w:val="22"/>
+          <w:szCs w:val="22"/>
+        </w:rPr>
+        <w:t xml:space="preserve">나는 이 결론에 대체로 공감하면서도, 실패의 기록이 성공의 기록보다 더 많은 것을 가르쳐 준다는 점이 이 책의 가장 큰 미덕이라고 생각한다. 성공 사례는 운이나 시대적 조건이 크게 작용해 그대로 따라 하기 어렵지만, 실패 사례는 "무엇을 하지 말아야 하는지"를 분명하게 알려 준다. 동시에 "상생의 자유무역"이 구체적으로 어떤 규칙과 제도로 가능할지는 독자인 내가 더 고민해야 할 숙제로 남았다. 한국 역시 경제 개발 초기에 일부 산업을 보호하며 성장한 경험이 있기 때문에, 후발국의 보호와 공정한 개방 사이의 균형점이 어디인지는 앞으로도 계속 생각해 볼 질문이다.</w:t>
       </w:r>
     </w:p>
     <w:p>
@@ -958,7 +988,7 @@
           <w:sz w:val="22"/>
           <w:szCs w:val="22"/>
         </w:rPr>
-        <w:t xml:space="preserve">『경제 전쟁의 흑역사』는 제목 그대로 인류가 경제를 둘러싸고 저지른 실수와 무모함의 기록이다. 하지만 이 책을 다 읽고 나서 남은 감정은 절망보다는 경계와 희망에 가까웠다. 과거의 실수를 알고 있다면 같은 실수를 반복하지 않을 수 있기 때문이다. 저자가 24가지 경제 전쟁을 통해 말하고자 한 것은, 상대를 무너뜨리려는 싸움보다 함께 규칙을 만들고 지키려는 노력이 결국 모두를 더 풍요롭게 한다는 사실이라고 생각한다.</w:t>
+        <w:t xml:space="preserve">『경제 전쟁의 흑역사』는 제목 그대로 인류가 경제를 둘러싸고 저지른 실수와 무모함의 기록이다. 하지만 이 책을 다 읽고 나서 남은 감정은 절망보다는 경계와 희망에 가까웠다. 저자의 말처럼 "역사에서 배우지 못하면 발전하지 못한다." 과거의 실수를 알고 있다면 같은 실수를 반복하지 않을 수 있다. 저자가 24가지 경제 전쟁을 통해 말하고자 한 것은, 상대를 무너뜨리려는 싸움보다 함께 규칙을 만들고 지키려는 노력이 결국 모두를 더 풍요롭게 한다는 사실이라고 생각한다.</w:t>
       </w:r>
     </w:p>
     <w:p>

</xml_diff>

<commit_message>
Tone down overstatements and fix factual slips in book report
Co-Authored-By: Claude Opus 5.5 <noreply@anthropic.com>
Claude-Session: https://claude.ai/code/session_01QWWxGnXdaFP6TZy6bNqdjA
</commit_message>
<xml_diff>
--- a/경제전쟁의흑역사_독후감.docx
+++ b/경제전쟁의흑역사_독후감.docx
@@ -58,52 +58,52 @@
           <w:sz w:val="22"/>
           <w:szCs w:val="22"/>
         </w:rPr>
-        <w:t xml:space="preserve">과제 때문에 이 책을 처음 받았을 때는 제목만 보고 딱딱한 경제사 책일 거라고 생각했다. 막상 읽어 보니 생각보다 훨씬 이야기처럼 읽혔다. 이 책은 15세기 대항해시대부터 코로나19 마스크 쟁탈전, 구글세 논란까지 경제 때문에 벌어진 싸움 24개를 시대 순서대로 다룬다. 1부 '뜨거운 전쟁'에는 후추 전쟁, 아편전쟁, 이라크전쟁처럼 실제로 총을 쏜 전쟁이 나오고, 2부 '차가운 전쟁'에는 관세, 환율, 수출 규제처럼 총 없이 벌어진 싸움이 나온다.</w:t>
-      </w:r>
-    </w:p>
-    <w:p>
-      <w:pPr>
-        <w:spacing w:after="80" w:line="276" w:lineRule="auto"/>
-        <w:ind w:firstLine="220"/>
-        <w:jc w:val="both"/>
-      </w:pPr>
-      <w:r>
-        <w:rPr>
-          <w:rFonts w:ascii="맑은 고딕" w:cs="맑은 고딕" w:eastAsia="맑은 고딕" w:hAnsi="맑은 고딕"/>
-          <w:sz w:val="22"/>
-          <w:szCs w:val="22"/>
-        </w:rPr>
-        <w:t xml:space="preserve">책 소개에 "과연 경제는 제로섬 게임일까?"라는 질문이 나오는데, 읽는 내내 이 질문이 머릿속에 남아 있었다. 누가 이기면 누가 반드시 지는 게 경제라면 싸움은 끝이 없을 것이다. 그런데 책에 나온 사례들을 보면 이긴 것처럼 보였던 쪽도 결국 손해를 본 경우가 훨씬 많았다. 부제에 붙은 "세계경제에 자살골을 날린 무모한 대결"이라는 말이 과장이 아니었다. 저자가 오래 경제 기자로 일해서인지 어려운 개념도 사건 위주로 풀어 줘서, 경제를 깊게 공부해 본 적 없는 나도 끝까지 읽을 수 있었다.</w:t>
-      </w:r>
-    </w:p>
-    <w:p>
-      <w:pPr>
-        <w:spacing w:after="80" w:line="276" w:lineRule="auto"/>
-        <w:ind w:firstLine="220"/>
-        <w:jc w:val="both"/>
-      </w:pPr>
-      <w:r>
-        <w:rPr>
-          <w:rFonts w:ascii="맑은 고딕" w:cs="맑은 고딕" w:eastAsia="맑은 고딕" w:hAnsi="맑은 고딕"/>
-          <w:sz w:val="22"/>
-          <w:szCs w:val="22"/>
-        </w:rPr>
-        <w:t xml:space="preserve">마침 요즘 뉴스에 관세 이야기가 거의 매일 나오고 있어서 더 관심을 가지고 읽게 됐다. 미국이 관세를 올린다는 기사가 나오면 주식 시장이 흔들리고 한국 기업들이 대책 회의를 한다는 소식이 이어진다. 전에는 그냥 지나쳤던 기사들인데, 이 책을 읽는 동안에는 이게 다 어디서 시작된 이야기인지 궁금해졌다.</w:t>
-      </w:r>
-    </w:p>
-    <w:p>
-      <w:pPr>
-        <w:spacing w:after="80" w:line="276" w:lineRule="auto"/>
-        <w:ind w:firstLine="220"/>
-        <w:jc w:val="both"/>
-      </w:pPr>
-      <w:r>
-        <w:rPr>
-          <w:rFonts w:ascii="맑은 고딕" w:cs="맑은 고딕" w:eastAsia="맑은 고딕" w:hAnsi="맑은 고딕"/>
-          <w:sz w:val="22"/>
-          <w:szCs w:val="22"/>
-        </w:rPr>
-        <w:t xml:space="preserve">읽기 편했던 이유가 하나 더 있다. 각 장이 본론으로 바로 들어가지 않고 엉뚱해 보이는 이야기로 시작한다. 구아노 전쟁은 '전설의 베트남 스키부대' 이야기로, 걸프전쟁은 트롤리의 딜레마로, 수에즈전쟁은 잡식동물의 딜레마로 시작하는 식이다. 처음에는 이게 전쟁이랑 무슨 상관인가 싶은데 읽다 보면 결국 본론과 연결된다. 덕분에 한 장씩 끊어 읽어도 지루하지 않았다.</w:t>
+        <w:t xml:space="preserve">과제 때문에 이 책을 처음 받았을 때는 제목만 보고 딱딱한 경제사 책일 거라고 생각했다. 막상 읽어 보니 생각보다 훨씬 이야기처럼 읽혔다. 이 책은 15세기 대항해시대부터 코로나19 마스크 쟁탈전, 구글세 논란까지 경제 때문에 벌어진 싸움 24개를 다룬다. 1부 '뜨거운 전쟁'에는 후추 전쟁, 아편전쟁, 이라크전쟁처럼 실제로 총을 쏜 전쟁이 나오고, 2부 '차가운 전쟁'에는 관세, 환율, 수출 규제처럼 총 없이 벌어진 싸움이 나온다.</w:t>
+      </w:r>
+    </w:p>
+    <w:p>
+      <w:pPr>
+        <w:spacing w:after="80" w:line="276" w:lineRule="auto"/>
+        <w:ind w:firstLine="220"/>
+        <w:jc w:val="both"/>
+      </w:pPr>
+      <w:r>
+        <w:rPr>
+          <w:rFonts w:ascii="맑은 고딕" w:cs="맑은 고딕" w:eastAsia="맑은 고딕" w:hAnsi="맑은 고딕"/>
+          <w:sz w:val="22"/>
+          <w:szCs w:val="22"/>
+        </w:rPr>
+        <w:t xml:space="preserve">책 소개에 "과연 경제는 제로섬 게임일까?"라는 질문이 나오는데, 읽는 내내 이 질문이 머릿속에 남아 있었다. 누가 이기면 누가 반드시 지는 게 경제라면 싸움은 끝이 없을 것이다. 그런데 책에 나온 사례들을 보면 이긴 것처럼 보였던 쪽도 나중에 대가를 치른 경우가 적지 않았다. 부제에 "세계경제에 자살골을 날린 무모한 대결"이라는 말이 왜 붙었는지 알 것 같았다. 저자가 오래 경제 기자로 일해서인지 어려운 개념도 사건 위주로 풀어 줘서, 경제를 깊게 공부해 본 적 없는 나도 끝까지 읽을 수 있었다.</w:t>
+      </w:r>
+    </w:p>
+    <w:p>
+      <w:pPr>
+        <w:spacing w:after="80" w:line="276" w:lineRule="auto"/>
+        <w:ind w:firstLine="220"/>
+        <w:jc w:val="both"/>
+      </w:pPr>
+      <w:r>
+        <w:rPr>
+          <w:rFonts w:ascii="맑은 고딕" w:cs="맑은 고딕" w:eastAsia="맑은 고딕" w:hAnsi="맑은 고딕"/>
+          <w:sz w:val="22"/>
+          <w:szCs w:val="22"/>
+        </w:rPr>
+        <w:t xml:space="preserve">마침 요즘 뉴스에 관세 이야기가 자주 나와서 더 관심을 가지고 읽게 됐다. 미국이 관세를 올린다는 기사가 나오면 한국 기업들이 어떻게 대응할지에 대한 기사도 같이 나온다. 전에는 그냥 지나쳤던 기사들인데, 이 책을 읽는 동안에는 이게 다 어디서 시작된 이야기인지 궁금해졌다.</w:t>
+      </w:r>
+    </w:p>
+    <w:p>
+      <w:pPr>
+        <w:spacing w:after="80" w:line="276" w:lineRule="auto"/>
+        <w:ind w:firstLine="220"/>
+        <w:jc w:val="both"/>
+      </w:pPr>
+      <w:r>
+        <w:rPr>
+          <w:rFonts w:ascii="맑은 고딕" w:cs="맑은 고딕" w:eastAsia="맑은 고딕" w:hAnsi="맑은 고딕"/>
+          <w:sz w:val="22"/>
+          <w:szCs w:val="22"/>
+        </w:rPr>
+        <w:t xml:space="preserve">읽기 편했던 이유가 하나 더 있다. 여러 장이 본론으로 바로 들어가지 않고 엉뚱해 보이는 이야기로 시작한다. 구아노 전쟁은 '전설의 베트남 스키부대' 이야기로, 걸프전쟁은 트롤리의 딜레마로, 수에즈전쟁은 잡식동물의 딜레마로 시작하는 식이다. 처음에는 이게 전쟁이랑 무슨 상관인가 싶은데, 그게 본론과 어떻게 이어지는지 따라가는 재미가 있었다.</w:t>
       </w:r>
     </w:p>
     <w:p>
@@ -148,7 +148,7 @@
           <w:sz w:val="22"/>
           <w:szCs w:val="22"/>
         </w:rPr>
-        <w:t xml:space="preserve">영국은 청나라에서 차를 엄청나게 사 갔지만, 청은 영국 물건을 별로 사지 않았다. 인구가 많고 웬만한 건 자급자족이 됐기 때문이다. 은이 계속 청으로 빠져나가자 영국은 인도에서 재배한 아편을 청에 몰래 팔기 시작했다. 청이 아편을 압수해서 없애 버리자 영국은 군함을 보내 전쟁을 일으켰고, 두 번의 전쟁 끝에 청은 홍콩을 넘겨주고 항구를 열어야 했다.</w:t>
+        <w:t xml:space="preserve">영국은 청나라에서 차를 엄청나게 사 갔지만, 청은 영국 물건을 별로 사지 않았다. 인구가 많고 웬만한 건 자급자족이 됐기 때문이다. 은이 계속 청으로 빠져나가자 영국은 인도에서 재배한 아편을 청에 대량으로 몰래 팔았다. 청이 아편을 압수해서 없애 버리자 영국은 군함을 보내 전쟁을 일으켰다. 청은 이 전쟁에서 져서 홍콩을 넘겨주고 항구를 열어야 했고, 두 번째 전쟁까지 지면서 더 많은 것을 내줬다.</w:t>
       </w:r>
     </w:p>
     <w:p>
@@ -208,7 +208,7 @@
           <w:sz w:val="22"/>
           <w:szCs w:val="22"/>
         </w:rPr>
-        <w:t xml:space="preserve">19세기에는 남아메리카 해안의 섬에 수천 년 동안 쌓인 새똥, 구아노가 최고의 비료로 인기를 끌었다. 비료가 귀하던 시절이라 유럽과 미국이 앞다퉈 사 갔고, 구아노와 초석이 묻힌 땅을 두고 칠레와 페루, 볼리비아가 전쟁까지 벌였다. 이 전쟁에서 진 볼리비아는 바다로 나가는 땅을 잃었고, 지금까지도 바다가 없는 나라로 남아 있다. 출판사 소개에서는 이 전쟁을 새똥이 발단이 된 현대 최초의 자원 전쟁이라고 부른다.</w:t>
+        <w:t xml:space="preserve">19세기에는 남아메리카 해안의 섬에 수천 년 동안 쌓인 새똥, 구아노가 좋은 비료로 인기를 끌었다. 비료가 귀하던 시절이라 유럽과 미국이 앞다퉈 사 갔고, 구아노와 초석이 묻힌 땅을 두고 칠레와 페루, 볼리비아가 전쟁까지 벌였다. 이 전쟁에서 진 볼리비아는 바다로 나가는 땅을 잃었고, 지금까지도 바다가 없는 나라로 남아 있다. 출판사 소개에서는 이 전쟁을 새똥이 발단이 된 현대 최초의 자원 전쟁이라고 부른다.</w:t>
       </w:r>
     </w:p>
     <w:p>
@@ -253,37 +253,37 @@
           <w:sz w:val="22"/>
           <w:szCs w:val="22"/>
         </w:rPr>
-        <w:t xml:space="preserve">1차 세계대전에서 이긴 영국과 프랑스는 독일에 엄청난 배상금을 물렸다. 독일은 그 돈을 갚으려고 돈을 계속 찍어 냈고, 1923년쯤에는 물가가 하루에도 몇 번씩 오르는 하이퍼인플레이션이 왔다. 독일 경제가 망가지자 주변 나라 경제도 같이 흔들렸고, 대공황까지 겹치면서 독일에서는 히틀러가 권력을 잡게 된다.</w:t>
-      </w:r>
-    </w:p>
-    <w:p>
-      <w:pPr>
-        <w:spacing w:after="80" w:line="276" w:lineRule="auto"/>
-        <w:ind w:firstLine="220"/>
-        <w:jc w:val="both"/>
-      </w:pPr>
-      <w:r>
-        <w:rPr>
-          <w:rFonts w:ascii="맑은 고딕" w:cs="맑은 고딕" w:eastAsia="맑은 고딕" w:hAnsi="맑은 고딕"/>
-          <w:sz w:val="22"/>
-          <w:szCs w:val="22"/>
-        </w:rPr>
-        <w:t xml:space="preserve">이 장의 제목이 '독일을 짓밟은 쾌감도 잠시, 서유럽의 자살골'인데 다 읽고 나서 이보다 맞는 표현이 없다고 생각했다. 영국과 프랑스 입장에서는 전쟁을 일으킨 독일을 확실히 혼내 주고 싶었을 것이다. 그 마음 자체는 이해가 간다. 그런데 그렇게 해서 결국 얻은 건 더 큰 전쟁이었다. 옆 나라가 망하면 나는 괜찮을 것 같지만 경제는 그렇게 돌아가지 않는다. 독일이 물건을 못 사면 프랑스도 팔 곳이 줄어든다. 화가 나서 내린 결정이 결국 자기한테 돌아온 것이다. 요즘 나라끼리 보복 관세를 주고받는 뉴스를 볼 때도 이 이야기가 계속 떠올랐다.</w:t>
-      </w:r>
-    </w:p>
-    <w:p>
-      <w:pPr>
-        <w:spacing w:after="80" w:line="276" w:lineRule="auto"/>
-        <w:ind w:firstLine="220"/>
-        <w:jc w:val="both"/>
-      </w:pPr>
-      <w:r>
-        <w:rPr>
-          <w:rFonts w:ascii="맑은 고딕" w:cs="맑은 고딕" w:eastAsia="맑은 고딕" w:hAnsi="맑은 고딕"/>
-          <w:sz w:val="22"/>
-          <w:szCs w:val="22"/>
-        </w:rPr>
-        <w:t xml:space="preserve">책은 이 장을 짐바브웨의 인플레이션 이야기로 시작하는데, 돈이 거의 휴지가 되는 걸 보면서 화폐 가치라는 게 결국 그 나라 경제를 사람들이 얼마나 믿느냐에 달려 있다는 걸 처음으로 제대로 느꼈다.</w:t>
+        <w:t xml:space="preserve">1차 세계대전에서 이긴 영국과 프랑스는 독일에 엄청난 배상금을 물렸다. 배상금 부담에 시달리던 독일은 돈을 계속 찍어 냈고, 1923년쯤에는 물가가 하루가 다르게 치솟는 하이퍼인플레이션이 왔다. 독일 경제가 망가지자 주변 나라 경제도 같이 흔들렸고, 대공황까지 겹치면서 독일에서는 히틀러가 권력을 잡게 된다.</w:t>
+      </w:r>
+    </w:p>
+    <w:p>
+      <w:pPr>
+        <w:spacing w:after="80" w:line="276" w:lineRule="auto"/>
+        <w:ind w:firstLine="220"/>
+        <w:jc w:val="both"/>
+      </w:pPr>
+      <w:r>
+        <w:rPr>
+          <w:rFonts w:ascii="맑은 고딕" w:cs="맑은 고딕" w:eastAsia="맑은 고딕" w:hAnsi="맑은 고딕"/>
+          <w:sz w:val="22"/>
+          <w:szCs w:val="22"/>
+        </w:rPr>
+        <w:t xml:space="preserve">이 장의 제목이 '독일을 짓밟은 쾌감도 잠시, 서유럽의 자살골'인데 다 읽고 나니 잘 맞는 표현이라는 생각이 들었다. 영국과 프랑스 입장에서는 전쟁을 일으킨 독일을 확실히 혼내 주고 싶었을 것이다. 그 마음 자체는 이해가 간다. 그런데 그 결정이 결국 더 큰 전쟁으로 이어지는 원인 중 하나가 됐다. 옆 나라가 망하면 나는 괜찮을 것 같지만 경제는 그렇게 돌아가지 않는다. 독일이 물건을 못 사면 프랑스도 팔 곳이 줄어든다. 화가 나서 내린 결정이 결국 자기한테 돌아온 것이다. 요즘 나라끼리 보복 관세를 주고받는 뉴스를 볼 때도 이 이야기가 떠올랐다.</w:t>
+      </w:r>
+    </w:p>
+    <w:p>
+      <w:pPr>
+        <w:spacing w:after="80" w:line="276" w:lineRule="auto"/>
+        <w:ind w:firstLine="220"/>
+        <w:jc w:val="both"/>
+      </w:pPr>
+      <w:r>
+        <w:rPr>
+          <w:rFonts w:ascii="맑은 고딕" w:cs="맑은 고딕" w:eastAsia="맑은 고딕" w:hAnsi="맑은 고딕"/>
+          <w:sz w:val="22"/>
+          <w:szCs w:val="22"/>
+        </w:rPr>
+        <w:t xml:space="preserve">책은 이 장을 짐바브웨의 인플레이션 이야기로 시작하는데, 돈이 거의 휴지가 되는 걸 보면서 화폐 가치라는 게 결국 그 나라 경제를 사람들이 얼마나 믿느냐에 달려 있다는 걸 조금은 알 것 같았다.</w:t>
       </w:r>
     </w:p>
     <w:p>
@@ -328,7 +328,7 @@
           <w:sz w:val="22"/>
           <w:szCs w:val="22"/>
         </w:rPr>
-        <w:t xml:space="preserve">전쟁의 명분이었던 무기가 발견되지 않았다는 건 알고 있었지만, 그 뒤에 석유와 돈 문제가 있었다는 설명을 들으니 사건이 전혀 다르게 보였다. 물론 전쟁이 일어난 이유를 하나로만 설명하기는 어려울 것이고, 이 부분은 저자의 해석이 꽤 강하게 들어가 있다고 느껴서 그대로 다 받아들이지는 않았다. 그래도 경제적 이익 때문에 전쟁까지 벌어질 수 있다는 게 제국주의 시대만의 이야기가 아니라 불과 20여 년 전의 일이라는 점은 오싹했다.</w:t>
+        <w:t xml:space="preserve">전쟁의 명분이었던 무기가 발견되지 않았다는 건 알고 있었지만, 그 뒤에 석유와 돈 문제가 있었다는 설명을 들으니 사건이 조금 다르게 보였다. 물론 전쟁이 일어난 이유를 하나로만 설명하기는 어려울 것이고, 이 부분은 저자의 해석이 꽤 강하게 들어가 있다고 느껴서 그대로 다 받아들이지는 않았다. 그래도 경제적 이익 때문에 전쟁까지 벌어질 수 있다는 게 제국주의 시대만의 이야기가 아니라 불과 20여 년 전의 일이라는 점은 오싹했다.</w:t>
       </w:r>
     </w:p>
     <w:p>
@@ -358,37 +358,37 @@
           <w:sz w:val="22"/>
           <w:szCs w:val="22"/>
         </w:rPr>
-        <w:t xml:space="preserve">대공황이 터지자 미국은 1930년에 스무트-홀리 관세법을 만들어 2만 개가 넘는 수입품에 높은 관세를 매겼다. 경제학자 천여 명이 반대하는 성명을 냈는데도 그대로 시행됐다. 그러자 캐나다와 유럽 나라들도 미국 물건에 보복 관세를 매겼고, 세계 무역이 크게 줄면서 불황은 더 깊어졌다. 저자는 이걸 '불타는 경제에 기름을 끼얹었다'고 표현한다.</w:t>
-      </w:r>
-    </w:p>
-    <w:p>
-      <w:pPr>
-        <w:spacing w:after="80" w:line="276" w:lineRule="auto"/>
-        <w:ind w:firstLine="220"/>
-        <w:jc w:val="both"/>
-      </w:pPr>
-      <w:r>
-        <w:rPr>
-          <w:rFonts w:ascii="맑은 고딕" w:cs="맑은 고딕" w:eastAsia="맑은 고딕" w:hAnsi="맑은 고딕"/>
-          <w:sz w:val="22"/>
-          <w:szCs w:val="22"/>
-        </w:rPr>
-        <w:t xml:space="preserve">'우리 산업을 지키자'는 말은 들으면 맞는 말 같다. 나도 처음엔 경제가 어려우면 수입을 좀 막는 게 당연하지 않나 생각했다. 그런데 상대 나라도 똑같이 막아 버리면 우리 물건도 못 판다. 지금 보면 너무 당연한 얘기인데, 그때 미국 정치인들은 그걸 알면서도 밀어붙였다.</w:t>
-      </w:r>
-    </w:p>
-    <w:p>
-      <w:pPr>
-        <w:spacing w:after="80" w:line="276" w:lineRule="auto"/>
-        <w:ind w:firstLine="220"/>
-        <w:jc w:val="both"/>
-      </w:pPr>
-      <w:r>
-        <w:rPr>
-          <w:rFonts w:ascii="맑은 고딕" w:cs="맑은 고딕" w:eastAsia="맑은 고딕" w:hAnsi="맑은 고딕"/>
-          <w:sz w:val="22"/>
-          <w:szCs w:val="22"/>
-        </w:rPr>
-        <w:t xml:space="preserve">전문가 천 명이 말려도 결국 통과됐다는 부분에서는 경제 정책이 꼭 경제 논리로만 정해지지는 않는다는 것도 알게 됐다. 당장 표가 되는 정책이 나라 전체에 좋은 정책은 아닐 수 있다. 요즘도 관세 이야기가 뉴스에 자주 나오는데, 그럴 때마다 이 사례를 떠올리게 된다.</w:t>
+        <w:t xml:space="preserve">대공황이 터지자 미국은 1930년에 스무트-홀리 관세법을 만들어 2만 개가 넘는 수입품에 높은 관세를 매겼다. 경제학자 천여 명이 반대하는 성명을 냈는데도 그대로 시행됐다. 그러자 캐나다와 유럽 나라들도 미국 물건에 보복 관세를 매겼고, 세계 무역이 크게 줄었고, 이 법이 불황을 더 깊게 만들었다는 평가를 받는다. 저자는 이걸 '불타는 경제에 기름을 끼얹었다'고 표현한다.</w:t>
+      </w:r>
+    </w:p>
+    <w:p>
+      <w:pPr>
+        <w:spacing w:after="80" w:line="276" w:lineRule="auto"/>
+        <w:ind w:firstLine="220"/>
+        <w:jc w:val="both"/>
+      </w:pPr>
+      <w:r>
+        <w:rPr>
+          <w:rFonts w:ascii="맑은 고딕" w:cs="맑은 고딕" w:eastAsia="맑은 고딕" w:hAnsi="맑은 고딕"/>
+          <w:sz w:val="22"/>
+          <w:szCs w:val="22"/>
+        </w:rPr>
+        <w:t xml:space="preserve">'우리 산업을 지키자'는 말은 들으면 맞는 말 같다. 나도 처음엔 경제가 어려우면 수입을 좀 막는 게 당연하지 않나 생각했다. 그런데 상대 나라도 똑같이 막아 버리면 우리 물건도 못 판다. 지금 보면 당연한 얘기인데, 그때 미국 정치인들은 전문가들의 경고를 듣고도 법을 밀어붙였다.</w:t>
+      </w:r>
+    </w:p>
+    <w:p>
+      <w:pPr>
+        <w:spacing w:after="80" w:line="276" w:lineRule="auto"/>
+        <w:ind w:firstLine="220"/>
+        <w:jc w:val="both"/>
+      </w:pPr>
+      <w:r>
+        <w:rPr>
+          <w:rFonts w:ascii="맑은 고딕" w:cs="맑은 고딕" w:eastAsia="맑은 고딕" w:hAnsi="맑은 고딕"/>
+          <w:sz w:val="22"/>
+          <w:szCs w:val="22"/>
+        </w:rPr>
+        <w:t xml:space="preserve">전문가 천 명이 말려도 결국 통과됐다는 부분에서는 경제 정책이 꼭 경제 논리로만 정해지지는 않는다는 것도 알게 됐다. 당장 표가 되는 정책이 나라 전체에 좋은 정책은 아닐 수 있다. 요즘도 관세 이야기가 뉴스에 자주 나오는데, 그럴 때 이 사례가 생각난다.</w:t>
       </w:r>
     </w:p>
     <w:p>
@@ -418,37 +418,37 @@
           <w:sz w:val="22"/>
           <w:szCs w:val="22"/>
         </w:rPr>
-        <w:t xml:space="preserve">1980년대 미국은 무역 적자가 심했고, 특히 일본 제품이 미국 시장을 휩쓸고 있었다. 1985년 미국, 일본, 서독, 영국, 프랑스가 뉴욕 플라자 호텔에 모여 달러 가치를 낮추기로 합의했는데, 이게 플라자 합의다. 그 뒤 엔화 가치는 2년 남짓 만에 거의 두 배로 뛰었다. 일본은 금리를 낮춰서 버텨 보려 했지만 풀린 돈이 부동산과 주식으로 몰려 거품이 생겼고, 1990년대 초 거품이 꺼지면서 '잃어버린 10년'이 시작됐다.</w:t>
-      </w:r>
-    </w:p>
-    <w:p>
-      <w:pPr>
-        <w:spacing w:after="80" w:line="276" w:lineRule="auto"/>
-        <w:ind w:firstLine="220"/>
-        <w:jc w:val="both"/>
-      </w:pPr>
-      <w:r>
-        <w:rPr>
-          <w:rFonts w:ascii="맑은 고딕" w:cs="맑은 고딕" w:eastAsia="맑은 고딕" w:hAnsi="맑은 고딕"/>
-          <w:sz w:val="22"/>
-          <w:szCs w:val="22"/>
-        </w:rPr>
-        <w:t xml:space="preserve">총 한 발 안 쏘고 호텔에서 회의 한 번 한 걸로 세계 2위 경제 대국의 흐름이 바뀌었다는 게 제일 놀라웠다. 환율은 뉴스에서 숫자로만 보던 거라 이렇게 무서운 무기가 될 줄은 몰랐다. 바로 앞 장이 스미스소니언협정, 그러니까 달러가 어떻게 기축통화가 됐는지에 대한 내용이라 이어서 읽으니 이해가 잘 됐다. 미국이 이런 합의를 밀어붙일 수 있었던 건 결국 달러가 세계의 기준이기 때문이다.</w:t>
-      </w:r>
-    </w:p>
-    <w:p>
-      <w:pPr>
-        <w:spacing w:after="80" w:line="276" w:lineRule="auto"/>
-        <w:ind w:firstLine="220"/>
-        <w:jc w:val="both"/>
-      </w:pPr>
-      <w:r>
-        <w:rPr>
-          <w:rFonts w:ascii="맑은 고딕" w:cs="맑은 고딕" w:eastAsia="맑은 고딕" w:hAnsi="맑은 고딕"/>
-          <w:sz w:val="22"/>
-          <w:szCs w:val="22"/>
-        </w:rPr>
-        <w:t xml:space="preserve">책을 읽고 나서 좀 더 찾아보니 일본이 합의 뒤에 대응을 잘못한 것도 장기 침체의 원인이었다는 분석이 있었다. 밖에서 오는 충격은 막을 수 없어도 그다음에 어떻게 하느냐는 스스로 정할 수 있다는 얘기라서, 개인한테도 해당되는 말 같았다. 같은 시기 한국은 엔고 덕분에 이른바 '3저 호황'을 누렸다고 하니, 강대국끼리의 싸움이 옆 나라한테는 기회가 되기도 한다는 게 신기했다.</w:t>
+        <w:t xml:space="preserve">1980년대 미국은 무역 적자가 심했고, 특히 일본 제품이 미국에서 많이 팔리고 있었다. 1985년 미국, 일본, 서독, 영국, 프랑스가 뉴욕 플라자 호텔에 모여 달러 가치를 낮추기로 합의했는데, 이게 플라자 합의다. 그 뒤 엔화 가치는 2년 남짓 만에 거의 두 배로 뛰었다. 일본은 금리를 낮춰서 버텨 보려 했지만 풀린 돈이 부동산과 주식으로 몰려 거품이 생겼고, 1990년대 초 거품이 꺼지면서 '잃어버린 10년'이 시작됐다.</w:t>
+      </w:r>
+    </w:p>
+    <w:p>
+      <w:pPr>
+        <w:spacing w:after="80" w:line="276" w:lineRule="auto"/>
+        <w:ind w:firstLine="220"/>
+        <w:jc w:val="both"/>
+      </w:pPr>
+      <w:r>
+        <w:rPr>
+          <w:rFonts w:ascii="맑은 고딕" w:cs="맑은 고딕" w:eastAsia="맑은 고딕" w:hAnsi="맑은 고딕"/>
+          <w:sz w:val="22"/>
+          <w:szCs w:val="22"/>
+        </w:rPr>
+        <w:t xml:space="preserve">총 한 발 안 쏘고 호텔에서 한 합의가 당시 세계 2위 경제 대국에 이렇게 큰 영향을 줬다는 게 제일 놀라웠다. 환율은 뉴스에서 숫자로만 보던 거라 이렇게 무서운 무기가 될 줄은 몰랐다. 바로 앞 장이 스미스소니언협정, 그러니까 달러가 어떻게 기축통화가 됐는지에 대한 내용이라 이어서 읽으니 이해가 잘 됐다. 미국이 이런 합의를 이끌어 낼 수 있었던 데에는 달러가 기축통화라는 점이 크게 작용했을 것 같다.</w:t>
+      </w:r>
+    </w:p>
+    <w:p>
+      <w:pPr>
+        <w:spacing w:after="80" w:line="276" w:lineRule="auto"/>
+        <w:ind w:firstLine="220"/>
+        <w:jc w:val="both"/>
+      </w:pPr>
+      <w:r>
+        <w:rPr>
+          <w:rFonts w:ascii="맑은 고딕" w:cs="맑은 고딕" w:eastAsia="맑은 고딕" w:hAnsi="맑은 고딕"/>
+          <w:sz w:val="22"/>
+          <w:szCs w:val="22"/>
+        </w:rPr>
+        <w:t xml:space="preserve">책을 읽고 나서 좀 더 찾아보니 일본이 합의 뒤에 대응을 잘못한 것도 장기 침체의 원인이었다는 분석이 있었다. 밖에서 오는 충격은 막을 수 없어도 그다음에 어떻게 하느냐는 스스로 정할 수 있다는 얘기라서, 개인한테도 해당되는 말 같았다. 같은 시기 한국은 엔고와 저유가, 저금리가 겹친 이른바 '3저 호황'을 누렸다고 하니, 강대국끼리의 싸움이 옆 나라한테는 기회가 되기도 한다는 게 신기했다.</w:t>
       </w:r>
     </w:p>
     <w:p>
@@ -478,37 +478,37 @@
           <w:sz w:val="22"/>
           <w:szCs w:val="22"/>
         </w:rPr>
-        <w:t xml:space="preserve">2019년 일본은 불화수소, 포토레지스트, 플루오린 폴리이미드 세 가지 반도체 소재의 한국 수출을 규제하고 한국을 화이트리스트에서 뺐다. 한국 기업들은 수입처를 바꾸고 국산화를 서둘렀고, 오히려 일본 소재 기업들이 고객을 잃는 결과가 나왔다. 저자는 이걸 두고 일본이 '잘못 긁어서 부스럼을 만들었다'고 말한다. 미중 무역 분쟁은 2018년 트럼프 정부가 중국 제품에 높은 관세를 매기고 중국이 똑같이 맞받아치면서 본격적으로 시작됐다.</w:t>
-      </w:r>
-    </w:p>
-    <w:p>
-      <w:pPr>
-        <w:spacing w:after="80" w:line="276" w:lineRule="auto"/>
-        <w:ind w:firstLine="220"/>
-        <w:jc w:val="both"/>
-      </w:pPr>
-      <w:r>
-        <w:rPr>
-          <w:rFonts w:ascii="맑은 고딕" w:cs="맑은 고딕" w:eastAsia="맑은 고딕" w:hAnsi="맑은 고딕"/>
-          <w:sz w:val="22"/>
-          <w:szCs w:val="22"/>
-        </w:rPr>
-        <w:t xml:space="preserve">한일 무역 분쟁은 내가 뉴스로 직접 본 일이라 더 와닿았다. 그때는 불매 운동 정도만 기억에 남아 있었는데, 책을 읽고 나서야 그 뒤에 어떤 흐름이 있었는지 알게 됐다. 요즘 경제 전쟁에서는 상대가 꼭 필요로 하는 걸 안 주는 게 무기가 되는데, 그 무기가 생각보다 오래가지 못한다는 것도 알게 됐다. 2010년 중국이 일본에 희토류 수출을 막았던 일도 결국 비슷하게 흘러갔다고 한다.</w:t>
-      </w:r>
-    </w:p>
-    <w:p>
-      <w:pPr>
-        <w:spacing w:after="80" w:line="276" w:lineRule="auto"/>
-        <w:ind w:firstLine="220"/>
-        <w:jc w:val="both"/>
-      </w:pPr>
-      <w:r>
-        <w:rPr>
-          <w:rFonts w:ascii="맑은 고딕" w:cs="맑은 고딕" w:eastAsia="맑은 고딕" w:hAnsi="맑은 고딕"/>
-          <w:sz w:val="22"/>
-          <w:szCs w:val="22"/>
-        </w:rPr>
-        <w:t xml:space="preserve">미중 분쟁을 치킨 게임에 비유한 부분도 기억에 남는다. 두 차가 마주 보고 달리다가 먼저 피하는 쪽이 지는 게임인데, 관세를 주고받으며 한 발도 안 물러서던 미국과 중국이 딱 그랬다. 저자는 '내가 무슨 짓을 할지 몰라' 하는 식으로 상대를 겁주는 미치광이 전략도 설명한다. 문제는 양쪽이 다 이 전략을 쓰면 결국 둘 다 부딪힌다는 것이다. 이 싸움이 지금은 반도체 같은 기술 쪽으로까지 번졌다는 걸 생각하면, 두 나라 모두와 거래하는 한국한테는 남의 일이 아니다.</w:t>
+        <w:t xml:space="preserve">2019년 일본은 불화수소, 포토레지스트, 플루오린 폴리이미드 세 가지 반도체 소재의 한국 수출을 규제하고 한국을 화이트리스트에서 뺐다. 한국 기업들은 수입처를 바꾸고 국산화를 서둘렀고, 일본 소재 기업들도 한국 매출이 줄어드는 타격을 입었다. 저자는 이걸 두고 일본이 '잘못 긁어서 부스럼을 만들었다'고 말한다. 미중 무역 분쟁은 2018년 트럼프 정부가 중국 제품에 높은 관세를 매기고 중국이 똑같이 맞받아치면서 본격적으로 시작됐다.</w:t>
+      </w:r>
+    </w:p>
+    <w:p>
+      <w:pPr>
+        <w:spacing w:after="80" w:line="276" w:lineRule="auto"/>
+        <w:ind w:firstLine="220"/>
+        <w:jc w:val="both"/>
+      </w:pPr>
+      <w:r>
+        <w:rPr>
+          <w:rFonts w:ascii="맑은 고딕" w:cs="맑은 고딕" w:eastAsia="맑은 고딕" w:hAnsi="맑은 고딕"/>
+          <w:sz w:val="22"/>
+          <w:szCs w:val="22"/>
+        </w:rPr>
+        <w:t xml:space="preserve">한일 무역 분쟁은 내가 뉴스로 직접 본 일이라 더 와닿았다. 그때는 불매 운동 정도만 기억에 남아 있었는데, 책을 읽고 나서야 그 뒤에 어떤 흐름이 있었는지 알게 됐다. 요즘 경제 전쟁에서는 상대가 꼭 필요로 하는 걸 안 주는 게 무기가 되는데, 그 무기가 생각만큼 오래 통하지는 않을 수 있다는 것도 알게 됐다. 2010년 중국이 일본에 희토류 수출을 막았던 일도 결국 비슷하게 흘러갔다고 한다.</w:t>
+      </w:r>
+    </w:p>
+    <w:p>
+      <w:pPr>
+        <w:spacing w:after="80" w:line="276" w:lineRule="auto"/>
+        <w:ind w:firstLine="220"/>
+        <w:jc w:val="both"/>
+      </w:pPr>
+      <w:r>
+        <w:rPr>
+          <w:rFonts w:ascii="맑은 고딕" w:cs="맑은 고딕" w:eastAsia="맑은 고딕" w:hAnsi="맑은 고딕"/>
+          <w:sz w:val="22"/>
+          <w:szCs w:val="22"/>
+        </w:rPr>
+        <w:t xml:space="preserve">미중 분쟁을 치킨 게임에 비유한 부분도 기억에 남는다. 두 차가 마주 보고 달리다가 먼저 피하는 쪽이 지는 게임인데, 관세를 주고받으며 한동안 물러서지 않던 미국과 중국의 모습이 그랬다. 저자는 '내가 무슨 짓을 할지 몰라' 하는 식으로 상대를 겁주는 미치광이 전략도 설명한다. 문제는 양쪽이 다 이 전략을 쓰면 둘 다 부딪혀 함께 망할 수 있다는 것이다. 이 싸움이 지금은 반도체 같은 기술 쪽으로까지 번졌다는 걸 생각하면, 두 나라 모두와 거래하는 한국한테는 남의 일이 아니다.</w:t>
       </w:r>
     </w:p>
     <w:p>
@@ -538,22 +538,22 @@
           <w:sz w:val="22"/>
           <w:szCs w:val="22"/>
         </w:rPr>
-        <w:t xml:space="preserve">코로나19가 처음 퍼졌을 때 전 세계가 마스크를 구하느라 난리가 났다. 돈을 더 주겠다는 나라에 이미 계약된 물량이 넘어가는 일이 생기면서, 독일 쪽에서는 미국이 마스크를 가로챘다며 '현대판 해적질'이라는 말까지 나왔다. 책은 이 사건을 통해 시장이 정말 모든 것을 해결할 수 있는지를 묻는다.</w:t>
-      </w:r>
-    </w:p>
-    <w:p>
-      <w:pPr>
-        <w:spacing w:after="80" w:line="276" w:lineRule="auto"/>
-        <w:ind w:firstLine="220"/>
-        <w:jc w:val="both"/>
-      </w:pPr>
-      <w:r>
-        <w:rPr>
-          <w:rFonts w:ascii="맑은 고딕" w:cs="맑은 고딕" w:eastAsia="맑은 고딕" w:hAnsi="맑은 고딕"/>
-          <w:sz w:val="22"/>
-          <w:szCs w:val="22"/>
-        </w:rPr>
-        <w:t xml:space="preserve">이 장은 내 기억과 바로 이어져서 더 생생했다. 그때 약국 앞에 줄을 서고, 요일별로 정해진 날에만 마스크를 살 수 있었던 기억이 난다. 그때는 그냥 불편하다고만 생각했는데, 이 책을 읽고 나니 그게 시장에만 맡겨 두면 돈 있는 사람과 돈 있는 나라가 다 가져가 버리는 상황을 막으려는 방법이었다는 걸 알게 됐다. 평소에는 시장이 가격을 정하는 게 가장 효율적이지만, 생명과 직결된 물건이 갑자기 부족해지면 이야기가 달라진다. 저자가 이 장의 마지막 과제로 연대와 협력을 이야기하는 것도 이 때문이라고 생각한다.</w:t>
+        <w:t xml:space="preserve">코로나19가 처음 퍼졌을 때 전 세계가 마스크를 구하느라 난리가 났다. 돈을 더 주겠다는 나라에 이미 계약된 물량이 넘어가는 일이 생기면서, 독일 베를린의 한 관리는 미국이 마스크를 가로챘다며 '현대판 해적질'이라는 말까지 했다. 책은 이 사건을 통해 시장이 정말 모든 것을 해결할 수 있는지를 묻는다.</w:t>
+      </w:r>
+    </w:p>
+    <w:p>
+      <w:pPr>
+        <w:spacing w:after="80" w:line="276" w:lineRule="auto"/>
+        <w:ind w:firstLine="220"/>
+        <w:jc w:val="both"/>
+      </w:pPr>
+      <w:r>
+        <w:rPr>
+          <w:rFonts w:ascii="맑은 고딕" w:cs="맑은 고딕" w:eastAsia="맑은 고딕" w:hAnsi="맑은 고딕"/>
+          <w:sz w:val="22"/>
+          <w:szCs w:val="22"/>
+        </w:rPr>
+        <w:t xml:space="preserve">이 장은 내 기억과 바로 이어져서 더 생생했다. 그때 약국 앞에 줄을 서고, 요일별로 정해진 날에만 마스크를 살 수 있었던 기억이 난다. 그때는 그냥 불편하다고만 생각했는데, 이 책을 읽고 나니 그게 시장에만 맡겨 두면 돈 있는 사람이 먼저 가져가 버리는 상황을 막으려는 방법이기도 했다는 걸 알게 됐다. 평소에는 시장이 가격을 정하는 게 가장 효율적이지만, 생명과 직결된 물건이 갑자기 부족해지면 이야기가 달라진다. 저자가 이 장의 마지막 과제로 연대와 협력을 이야기하는 것도 이 때문이라고 생각한다.</w:t>
       </w:r>
     </w:p>
     <w:p>
@@ -643,37 +643,37 @@
           <w:sz w:val="22"/>
           <w:szCs w:val="22"/>
         </w:rPr>
-        <w:t xml:space="preserve">아홉 가지를 다시 보면 공통점이 하나 있다. 상대를 이기려고 극단적으로 나간 쪽이 결국 손해를 봤다는 것이다. 아편으로 청을 무너뜨린 영국은 두고두고 비판을 받았고, 구아노를 두고 싸운 나라들은 사람과 땅을 잃었고, 독일을 짓밟은 승전국들은 더 큰 전쟁을 맞았다. 관세로 문을 닫은 미국은 수출길이 막혔고, 소재 수출을 막은 일본은 오히려 자기 기업들이 고객을 잃었다. 마스크를 서로 가로채던 나라들도 결국 모두가 위험해지는 상황을 피하지 못했다.</w:t>
-      </w:r>
-    </w:p>
-    <w:p>
-      <w:pPr>
-        <w:spacing w:after="80" w:line="276" w:lineRule="auto"/>
-        <w:ind w:firstLine="220"/>
-        <w:jc w:val="both"/>
-      </w:pPr>
-      <w:r>
-        <w:rPr>
-          <w:rFonts w:ascii="맑은 고딕" w:cs="맑은 고딕" w:eastAsia="맑은 고딕" w:hAnsi="맑은 고딕"/>
-          <w:sz w:val="22"/>
-          <w:szCs w:val="22"/>
-        </w:rPr>
-        <w:t xml:space="preserve">그렇다고 저자가 무조건 자유무역이 옳다고 하는 것도 아니다. 지금까지의 자유무역은 선진국한테 유리하게 돌아갔고, 반대로 보호무역으로 가면 분업으로 얻는 효율을 포기해야 한다. 저자가 내놓는 답은 '호혜와 평등을 기반으로 한 상생의 자유무역'이다. 대륙봉쇄령을 다룬 장에서 후발국 입장에서 보호무역을 옹호했던 프리드리히 리스트를 같이 소개하는 것도 그런 이유인 것 같다.</w:t>
-      </w:r>
-    </w:p>
-    <w:p>
-      <w:pPr>
-        <w:spacing w:after="80" w:line="276" w:lineRule="auto"/>
-        <w:ind w:firstLine="220"/>
-        <w:jc w:val="both"/>
-      </w:pPr>
-      <w:r>
-        <w:rPr>
-          <w:rFonts w:ascii="맑은 고딕" w:cs="맑은 고딕" w:eastAsia="맑은 고딕" w:hAnsi="맑은 고딕"/>
-          <w:sz w:val="22"/>
-          <w:szCs w:val="22"/>
-        </w:rPr>
-        <w:t xml:space="preserve">아홉 개 중에서 딱 하나만 고르라면 나는 베르사유조약을 고르겠다. 다른 전쟁들은 돈이나 자원 때문에 시작됐지만, 베르사유조약은 복수하고 싶은 마음이 경제 정책이 된 경우였다. 계산보다 감정이 앞섰을 때 얼마나 큰 대가를 치르는지 가장 분명하게 보여 준 사례라고 생각한다. 사람도 화가 났을 때 내린 결정을 나중에 후회하는 경우가 많은데, 나라도 크게 다르지 않았다.</w:t>
+        <w:t xml:space="preserve">아홉 가지를 다시 보면 공통점이 하나 있다. 극단적인 싸움은 어느 쪽에든 큰 상처를 남겼고, 이긴 쪽도 생각만큼 얻은 게 없거나 나중에 대가를 치른 경우가 많았다는 것이다. 아편전쟁은 영국에 당장은 이익이었지만 지금까지도 가장 부끄러운 전쟁 중 하나로 남았다. 구아노 전쟁에서 진 볼리비아는 바다를 잃었고, 독일을 짓밟은 승전국들은 결국 또 한 번의 세계대전을 겪었다. 관세로 문을 닫은 미국은 수출길이 막혔고, 소재 수출을 막은 일본은 자기 기업들도 타격을 입었다.</w:t>
+      </w:r>
+    </w:p>
+    <w:p>
+      <w:pPr>
+        <w:spacing w:after="80" w:line="276" w:lineRule="auto"/>
+        <w:ind w:firstLine="220"/>
+        <w:jc w:val="both"/>
+      </w:pPr>
+      <w:r>
+        <w:rPr>
+          <w:rFonts w:ascii="맑은 고딕" w:cs="맑은 고딕" w:eastAsia="맑은 고딕" w:hAnsi="맑은 고딕"/>
+          <w:sz w:val="22"/>
+          <w:szCs w:val="22"/>
+        </w:rPr>
+        <w:t xml:space="preserve">그렇다고 저자가 무조건 자유무역이 옳다고 하는 것도 아니다. 저자는 지금까지의 자유무역이 선진국한테 유리하게 돌아갔다고 보고, 반대로 보호무역으로 가면 분업으로 얻는 효율을 포기해야 한다. 저자가 내놓는 답은 '호혜와 평등을 기반으로 한 상생의 자유무역'이다. 대륙봉쇄령을 다룬 장에서 후발국 입장에서 보호무역을 옹호했던 프리드리히 리스트를 같이 소개하는 것도 그런 이유인 것 같다.</w:t>
+      </w:r>
+    </w:p>
+    <w:p>
+      <w:pPr>
+        <w:spacing w:after="80" w:line="276" w:lineRule="auto"/>
+        <w:ind w:firstLine="220"/>
+        <w:jc w:val="both"/>
+      </w:pPr>
+      <w:r>
+        <w:rPr>
+          <w:rFonts w:ascii="맑은 고딕" w:cs="맑은 고딕" w:eastAsia="맑은 고딕" w:hAnsi="맑은 고딕"/>
+          <w:sz w:val="22"/>
+          <w:szCs w:val="22"/>
+        </w:rPr>
+        <w:t xml:space="preserve">아홉 개 중에서 딱 하나만 고르라면 나는 베르사유조약을 고르겠다. 다른 사례들은 주로 돈이나 자원을 둘러싼 싸움이었지만, 베르사유조약은 복수심이 경제 정책에 크게 작용한 경우였다. 계산보다 감정이 앞섰을 때 얼마나 큰 대가를 치르는지 잘 보여 준 사례라고 생각한다. 사람도 화가 났을 때 내린 결정을 나중에 후회하는 경우가 많은데, 나라도 크게 다르지 않았다.</w:t>
       </w:r>
     </w:p>
     <w:p>
@@ -718,7 +718,7 @@
           <w:sz w:val="22"/>
           <w:szCs w:val="22"/>
         </w:rPr>
-        <w:t xml:space="preserve">책은 나라 사이의 이야기지만 읽다 보니 기업한테 그대로 적용되는 부분이 많았다. 특히 한국 기업은 원자재를 들여와서 만들어 파는 구조가 많아서 이런 경제 전쟁에 더 약하다. 반도체, 자동차, 배터리 같은 주력 산업이 다 그렇다. 요즘도 미국의 관세 정책이 바뀔 때마다 한국 자동차나 철강 회사들이 대응책을 찾느라 바쁘다는 기사가 계속 나온다. 경제 전쟁이 기업한테는 먼 역사가 아니라 매일 부딪히는 현실인 셈이다. 책을 읽으면서 기업이라면 이렇게 하면 좋겠다고 생각한 것들을 적어 보았다.</w:t>
+        <w:t xml:space="preserve">책은 나라 사이의 이야기지만 읽다 보니 기업한테 그대로 적용되는 부분이 많았다. 특히 한국 기업은 원자재를 들여와서 만들어 파는 구조가 많아서 이런 경제 전쟁의 영향을 크게 받는다. 반도체, 자동차, 배터리 같은 주력 산업도 상당수가 그렇다. 요즘도 미국의 관세 정책이 바뀔 때마다 한국 자동차나 철강 회사들이 대응책을 찾느라 바쁘다는 기사가 자주 나온다. 경제 전쟁이 기업한테는 먼 역사가 아니라 지금 부딪히는 현실인 셈이다. 책을 읽으면서 기업이라면 이렇게 하면 좋겠다고 생각한 것들을 적어 보았다.</w:t>
       </w:r>
     </w:p>
     <w:p>
@@ -748,7 +748,7 @@
           <w:sz w:val="22"/>
           <w:szCs w:val="22"/>
         </w:rPr>
-        <w:t xml:space="preserve">한일 무역 분쟁 때 한국 기업들은 대체 공급처를 찾느라 급하게 움직여야 했다. 핵심 소재를 한 나라, 한 회사에만 의존하면 그 나라가 마음먹는 순간 공장이 멈출 수도 있다. 그래서 먼저 대체하기 어려운 부품이나 소재가 뭔지 파악해 두고, 공급처는 적어도 두 군데 이상 확보하고, 재고도 조금은 넉넉하게 가져가는 게 좋다고 본다. 비용은 늘겠지만 일종의 보험료라고 생각하면 된다. 길게 보면 국내 협력사와 같이 기술을 키우는 게 제일 확실한 방법이다.</w:t>
+        <w:t xml:space="preserve">한일 무역 분쟁 때 한국 기업들은 대체 공급처를 찾느라 급하게 움직여야 했다. 핵심 소재를 한 나라, 한 회사에만 의존하면 그 나라가 마음먹는 순간 공장이 멈출 수도 있다. 그래서 먼저 대체하기 어려운 부품이나 소재가 뭔지 파악해 두고, 공급처는 적어도 두 군데 이상 확보하고, 재고도 조금은 넉넉하게 가져가는 게 좋다고 본다. 비용은 늘겠지만 일종의 보험료라고 생각하면 된다. 길게 보면 국내 협력사와 같이 기술을 키우는 것도 좋은 방법이다.</w:t>
       </w:r>
     </w:p>
     <w:p>
@@ -778,7 +778,7 @@
           <w:sz w:val="22"/>
           <w:szCs w:val="22"/>
         </w:rPr>
-        <w:t xml:space="preserve">마스크 사태 때 가격을 몇 배로 올려 팔거나 물건을 쌓아 두던 업체들이 있었는데, 결국 정부가 직접 유통에 나서고 매점매석을 막는 규제가 생겼다. 위기 때 눈앞의 이익만 챙기면 소비자의 신뢰를 잃고 더 강한 규제를 부르게 된다. 기업도 나라와 마찬가지로 급할 때 나만 살겠다고 움직이면 나중에 더 큰 대가를 치를 수 있다. 오히려 어려울 때 공급을 지키고 가격을 크게 올리지 않은 기업이 오래 기억에 남는다.</w:t>
+        <w:t xml:space="preserve">마스크 사태 때 가격을 몇 배로 올려 팔거나 물건을 쌓아 두던 업체들이 있었는데, 정부가 공적 마스크 제도를 만들고 매점매석을 금지하는 조치까지 내놓았다. 위기 때 눈앞의 이익만 챙기면 소비자의 신뢰를 잃고 더 강한 규제를 부르게 된다. 기업도 나라와 마찬가지로 급할 때 나만 살겠다고 움직이면 나중에 더 큰 대가를 치를 수 있다. 반대로 어려울 때 가격을 크게 올리지 않은 기업은 소비자들에게 좋은 기억으로 남는다.</w:t>
       </w:r>
     </w:p>
     <w:p>
@@ -808,7 +808,7 @@
           <w:sz w:val="22"/>
           <w:szCs w:val="22"/>
         </w:rPr>
-        <w:t xml:space="preserve">플라자 합의를 보면 환율이 한 번 크게 움직이면 수출 기업의 이익이 순식간에 사라질 수 있다. 수출을 많이 하는 기업이라면 선물환 같은 방법으로 환율 위험을 미리 막아 두고, 생산과 판매를 여러 통화권에 나눠 두는 게 필요하다. 그리고 일본처럼 위기 뒤에 돈이 싸게 풀렸다고 해서 본업과 상관없는 부동산이나 투기성 자산에 무리하게 돈을 넣는 건 피해야 한다.</w:t>
+        <w:t xml:space="preserve">플라자 합의를 보면 환율이 한 번 크게 움직이면 수출 기업의 이익이 크게 줄어들 수 있다. 수출을 많이 하는 기업이라면 선물환 같은 방법으로 환율 위험을 미리 막아 두고, 생산과 판매를 여러 통화권에 나눠 두는 게 필요하다. 그리고 일본처럼 위기 뒤에 돈이 싸게 풀렸다고 해서 본업과 상관없는 부동산이나 투기성 자산에 무리하게 돈을 넣는 건 피해야 한다.</w:t>
       </w:r>
     </w:p>
     <w:p>
@@ -838,7 +838,7 @@
           <w:sz w:val="22"/>
           <w:szCs w:val="22"/>
         </w:rPr>
-        <w:t xml:space="preserve">요즘은 관세율 하나, 수출 통제 목록 한 줄에 사업 전체가 흔들린다. 그러니 각국 정책을 꾸준히 지켜보는 담당 부서를 두고, 관세가 오르면 어떻게 할지, 수출이 막히면 어떻게 할지 미리 계획을 세워 둬야 한다. 스무트-홀리 때처럼 한 나라가 움직이면 다른 나라도 반드시 반응하니까 그다음 수까지 생각해야 한다. 제재 규정을 잘못 어기면 벌금 정도가 아니라 시장 자체를 잃을 수도 있어서 준법 관리도 꼼꼼히 해야 한다.</w:t>
+        <w:t xml:space="preserve">요즘은 관세율 하나, 수출 통제 목록 한 줄에 사업이 크게 흔들리기도 한다. 그러니 각국 정책을 꾸준히 지켜보는 담당 부서를 두고, 관세가 오르면 어떻게 할지, 수출이 막히면 어떻게 할지 미리 계획을 세워 둬야 한다. 스무트-홀리 때처럼 한 나라가 움직이면 다른 나라도 대개 반응하니까 그다음 수까지 생각해야 한다. 제재 규정을 잘못 어기면 벌금 정도가 아니라 시장 자체를 잃을 수도 있어서 준법 관리도 꼼꼼히 해야 한다.</w:t>
       </w:r>
     </w:p>
     <w:p>
@@ -868,7 +868,7 @@
           <w:sz w:val="22"/>
           <w:szCs w:val="22"/>
         </w:rPr>
-        <w:t xml:space="preserve">외국 기업이 '우리 일자리를 뺏는다'는 이미지가 생기면 관세나 규제의 표적이 되기 쉽다. 반대로 현지에 공장을 짓고 사람을 뽑으면 보호무역 바람이 불어도 덜 흔들린다. 요즘 한국 배터리, 자동차 회사들이 미국에 공장을 많이 짓는 것도 이런 이유가 크다고 본다. 미국이 2022년 인플레이션 감축법(IRA)을 만들면서 북미에서 만든 전기차와 배터리에만 보조금을 주기로 한 뒤로 이런 움직임이 더 빨라졌다. 물론 돈이 많이 드는 일이니까 어느 시장에 얼마나 들어갈지는 신중하게 따져 봐야 한다.</w:t>
+        <w:t xml:space="preserve">외국 기업이 '우리 일자리를 뺏는다'는 이미지가 생기면 관세나 규제의 표적이 되기 쉽다. 반대로 현지에 공장을 짓고 사람을 뽑으면 보호무역 바람이 불어도 덜 흔들린다. 요즘 한국 배터리, 자동차 회사들이 미국에 공장을 많이 짓는 것도 이런 이유가 크다고 본다. 미국이 2022년 인플레이션 감축법(IRA)을 만들면서 북미에서 조립한 전기차에만 세액공제 혜택을 주기로 하면서 한동안 이런 움직임이 더 빨라졌다. 물론 돈이 많이 드는 일이니까 어느 시장에 얼마나 들어갈지는 신중하게 따져 봐야 한다.</w:t>
       </w:r>
     </w:p>
     <w:p>
@@ -1003,37 +1003,37 @@
           <w:sz w:val="22"/>
           <w:szCs w:val="22"/>
         </w:rPr>
-        <w:t xml:space="preserve">또 속 시원해 보이는 해결책을 조금 의심하게 됐다. 수입을 막으면 우리 산업이 살아날 것 같고, 금리를 내리면 경기가 좋아질 것 같지만, 책에 나온 사례들은 대부분 반대로 흘러갔다. 요즘은 어떤 정책 얘기를 들으면 상대가 어떻게 나올지, 그게 다시 우리한테 어떻게 돌아올지를 한 번 더 생각해 보려고 한다.</w:t>
-      </w:r>
-    </w:p>
-    <w:p>
-      <w:pPr>
-        <w:spacing w:after="80" w:line="276" w:lineRule="auto"/>
-        <w:ind w:firstLine="220"/>
-        <w:jc w:val="both"/>
-      </w:pPr>
-      <w:r>
-        <w:rPr>
-          <w:rFonts w:ascii="맑은 고딕" w:cs="맑은 고딕" w:eastAsia="맑은 고딕" w:hAnsi="맑은 고딕"/>
-          <w:sz w:val="22"/>
-          <w:szCs w:val="22"/>
-        </w:rPr>
-        <w:t xml:space="preserve">이건 나라 사이의 일만도 아니었다. 조별 과제를 할 때도 내 몫만 챙기려고 하면 당장은 편해도 결국 팀 전체 결과가 나빠진다. 베르사유조약 이야기를 읽으면서 이런 경험들이 많이 떠올랐다.</w:t>
-      </w:r>
-    </w:p>
-    <w:p>
-      <w:pPr>
-        <w:spacing w:after="80" w:line="276" w:lineRule="auto"/>
-        <w:ind w:firstLine="220"/>
-        <w:jc w:val="both"/>
-      </w:pPr>
-      <w:r>
-        <w:rPr>
-          <w:rFonts w:ascii="맑은 고딕" w:cs="맑은 고딕" w:eastAsia="맑은 고딕" w:hAnsi="맑은 고딕"/>
-          <w:sz w:val="22"/>
-          <w:szCs w:val="22"/>
-        </w:rPr>
-        <w:t xml:space="preserve">한쪽 말만 듣고 판단하지 않으려는 습관도 생겼다. 경제 분쟁이 생기면 각 나라는 자기는 방어했을 뿐이고 상대가 먼저 공격했다고 말한다. 그래서 요즘은 기사 하나만 보고 끝내지 않고, 상대 쪽 입장은 어떻게 나오는지, 실제 숫자는 어떤지 한 번 더 찾아보고 있다.</w:t>
+        <w:t xml:space="preserve">또 속 시원해 보이는 해결책을 조금 의심하게 됐다. 수입을 막으면 우리 산업이 살아날 것 같고, 금리를 내리면 경기가 좋아질 것 같지만, 책에 나온 사례들 중에는 오히려 반대로 흘러간 경우가 많았다. 요즘은 어떤 정책 얘기를 들으면 상대가 어떻게 나올지, 그게 다시 우리한테 어떻게 돌아올지를 한 번 더 생각해 보려고 한다.</w:t>
+      </w:r>
+    </w:p>
+    <w:p>
+      <w:pPr>
+        <w:spacing w:after="80" w:line="276" w:lineRule="auto"/>
+        <w:ind w:firstLine="220"/>
+        <w:jc w:val="both"/>
+      </w:pPr>
+      <w:r>
+        <w:rPr>
+          <w:rFonts w:ascii="맑은 고딕" w:cs="맑은 고딕" w:eastAsia="맑은 고딕" w:hAnsi="맑은 고딕"/>
+          <w:sz w:val="22"/>
+          <w:szCs w:val="22"/>
+        </w:rPr>
+        <w:t xml:space="preserve">이건 나라 사이의 일만도 아니었다. 조별 과제를 할 때도 내 몫만 챙기려고 하면 당장은 편해도 결국 팀 전체 결과가 나빠진다. 베르사유조약 이야기를 읽으면서 이런 경험이 떠올랐다.</w:t>
+      </w:r>
+    </w:p>
+    <w:p>
+      <w:pPr>
+        <w:spacing w:after="80" w:line="276" w:lineRule="auto"/>
+        <w:ind w:firstLine="220"/>
+        <w:jc w:val="both"/>
+      </w:pPr>
+      <w:r>
+        <w:rPr>
+          <w:rFonts w:ascii="맑은 고딕" w:cs="맑은 고딕" w:eastAsia="맑은 고딕" w:hAnsi="맑은 고딕"/>
+          <w:sz w:val="22"/>
+          <w:szCs w:val="22"/>
+        </w:rPr>
+        <w:t xml:space="preserve">한쪽 말만 듣고 판단하지 않으려는 습관도 생겼다. 경제 분쟁이 생기면 각 나라는 자기는 방어했을 뿐이고 상대가 먼저 공격했다고 말하는 경우가 많다. 그래서 요즘은 기사 하나만 보고 끝내지 않고, 상대 쪽 입장은 어떻게 나오는지, 실제 숫자는 어떤지 한 번 더 찾아보려고 한다.</w:t>
       </w:r>
     </w:p>
     <w:p>
@@ -1168,7 +1168,7 @@
           <w:sz w:val="22"/>
           <w:szCs w:val="22"/>
         </w:rPr>
-        <w:t xml:space="preserve">책을 읽기 전의 나한테 경제는 시험 범위에 들어가는 그래프와 용어였다. 관세나 환율이라는 말은 알았지만 그게 실제로 한 나라를 무너뜨리고 전쟁까지 불렀다는 건 실감하지 못했다. 지금은 관세라는 말을 들으면 스무트-홀리 관세법이, 환율이라는 말을 들으면 플라자 합의 이후의 일본이 같이 떠오른다.</w:t>
+        <w:t xml:space="preserve">책을 읽기 전의 나한테 경제는 시험 범위에 들어가는 그래프와 용어였다. 관세나 환율이라는 말은 알았지만 그게 한 나라 경제를 크게 흔들고 전쟁의 원인이 되기도 했다는 건 실감하지 못했다. 지금은 관세라는 말을 들으면 스무트-홀리 관세법이, 환율이라는 말을 들으면 플라자 합의 이후의 일본이 같이 떠오른다.</w:t>
       </w:r>
     </w:p>
     <w:p>

</xml_diff>

<commit_message>
Fill in student info and tailor major paragraph to AI/data
Co-Authored-By: Claude Opus 5.5 <noreply@anthropic.com>
Claude-Session: https://claude.ai/code/session_01QWWxGnXdaFP6TZy6bNqdjA
</commit_message>
<xml_diff>
--- a/경제전쟁의흑역사_독후감.docx
+++ b/경제전쟁의흑역사_독후감.docx
@@ -43,7 +43,7 @@
           <w:sz w:val="22"/>
           <w:szCs w:val="22"/>
         </w:rPr>
-        <w:t xml:space="preserve">학과: ____________   학번: ____________   이름: ____________</w:t>
+        <w:t xml:space="preserve">AI데이터융합학부   202603269   한민준</w:t>
       </w:r>
     </w:p>
     <w:p>
@@ -1168,7 +1168,7 @@
           <w:sz w:val="22"/>
           <w:szCs w:val="22"/>
         </w:rPr>
-        <w:t xml:space="preserve">전공 수업에서도 이 책의 사례를 연결해 보고 싶다. 공급망이나 환율, 국제 조세는 나중에 어떤 회사에서 일하든 한 번쯤은 마주칠 주제다. 방학에는 국제 통상 관련 책을 한 권 더 읽어 보거나 무역 관련 자격증 공부를 시작해 볼 생각이다.</w:t>
+        <w:t xml:space="preserve">전공 공부와도 연결해 보고 싶다. AI와 데이터를 공부하는 입장에서, 책에 나온 사건들을 실제 데이터로 확인해 보면 재미있을 것 같다. 예를 들어 플라자 합의 전후의 엔화 환율이나 스무트-홀리 관세법 이후의 무역량 변화를 직접 그래프로 그려 보면 책에서 읽은 내용이 더 잘 와닿을 것 같다. 기업이 공급망 위험을 데이터로 미리 파악하는 일도 있다고 하니, 나중에 이런 분야에서 배운 걸 써 볼 수 있을지도 관심이 생겼다.</w:t>
       </w:r>
     </w:p>
     <w:p>

</xml_diff>